<commit_message>
docs: update product design document
</commit_message>
<xml_diff>
--- a/科研成长日志产品设计文档.docx
+++ b/科研成长日志产品设计文档.docx
@@ -5,461 +5,940 @@
     <w:p>
       <w:pPr>
         <w:pStyle w:val="Title"/>
-        <w:spacing w:after="240"/>
         <w:jc w:val="center"/>
       </w:pPr>
       <w:r>
         <w:rPr>
-          <w:rFonts w:ascii="Aptos" w:hAnsi="Aptos" w:eastAsia="Microsoft YaHei"/>
+          <w:rFonts w:ascii="Microsoft YaHei" w:hAnsi="Microsoft YaHei" w:eastAsia="Microsoft YaHei"/>
           <w:b/>
           <w:color w:val="000000"/>
-          <w:sz w:val="44"/>
+          <w:sz w:val="50"/>
         </w:rPr>
         <w:t>科研成长日志产品设计文档</w:t>
       </w:r>
     </w:p>
     <w:p>
       <w:pPr>
-        <w:spacing w:after="440"/>
+        <w:spacing w:after="60"/>
         <w:jc w:val="center"/>
       </w:pPr>
       <w:r>
         <w:rPr>
-          <w:rFonts w:ascii="Aptos" w:hAnsi="Aptos" w:eastAsia="Microsoft YaHei"/>
-          <w:color w:val="000000"/>
-          <w:sz w:val="22"/>
+          <w:rFonts w:ascii="Microsoft YaHei" w:hAnsi="Microsoft YaHei" w:eastAsia="Microsoft YaHei"/>
+          <w:b/>
+          <w:color w:val="404040"/>
+          <w:sz w:val="23"/>
         </w:rPr>
-        <w:t>MVP 版本</w:t>
+        <w:t>当前版本 v2.2 云端化准备阶段</w:t>
       </w:r>
     </w:p>
     <w:p>
       <w:pPr>
-        <w:spacing w:after="240" w:line="324" w:lineRule="auto"/>
+        <w:spacing w:after="360"/>
+        <w:jc w:val="center"/>
       </w:pPr>
       <w:r>
         <w:rPr>
-          <w:rFonts w:ascii="Aptos" w:hAnsi="Aptos" w:eastAsia="Microsoft YaHei"/>
-          <w:b w:val="0"/>
-          <w:color w:val="000000"/>
-          <w:sz w:val="22"/>
+          <w:rFonts w:ascii="Microsoft YaHei" w:hAnsi="Microsoft YaHei" w:eastAsia="Microsoft YaHei"/>
+          <w:color w:val="606060"/>
+          <w:sz w:val="19"/>
         </w:rPr>
-        <w:t>本文件定义科研成长日志 MVP 的产品方向、目标用户与功能边界。第一版只验证个人用户是否能够持续完成每日记录、回顾历史内容并快速检索关键信息。</w:t>
+        <w:t>更新日期 2026年10月14日</w:t>
+      </w:r>
+    </w:p>
+    <w:p>
+      <w:r>
+        <w:rPr>
+          <w:rFonts w:ascii="Microsoft YaHei" w:hAnsi="Microsoft YaHei" w:eastAsia="Microsoft YaHei"/>
+          <w:sz w:val="21"/>
+        </w:rPr>
+        <w:t>科研成长日志已经从单用户记录工具演进为支持多人使用的个人科研日志系统。当前产品已完成注册登录、Session、用户数据隔离、用户时区、个人设置和登录后 Dashboard，并完成 PostgreSQL 适配、数据迁移演练与 staging 部署工程准备。云端数据库和 Vercel 项目尚未创建，本文将已上线能力、工程准备和后续规划分开说明。</w:t>
       </w:r>
     </w:p>
     <w:p>
       <w:pPr>
         <w:pStyle w:val="Heading1"/>
-        <w:spacing w:before="280" w:after="120"/>
+        <w:keepNext/>
       </w:pPr>
       <w:r>
-        <w:rPr>
-          <w:rFonts w:ascii="Aptos" w:hAnsi="Aptos" w:eastAsia="Microsoft YaHei"/>
-          <w:b/>
-          <w:color w:val="000000"/>
-          <w:sz w:val="30"/>
-        </w:rPr>
         <w:t>1 产品定位</w:t>
       </w:r>
     </w:p>
     <w:p>
-      <w:pPr>
-        <w:spacing w:after="140" w:line="324" w:lineRule="auto"/>
-      </w:pPr>
       <w:r>
         <w:rPr>
-          <w:rFonts w:ascii="Aptos" w:hAnsi="Aptos" w:eastAsia="Microsoft YaHei"/>
-          <w:b w:val="0"/>
-          <w:color w:val="000000"/>
+          <w:rFonts w:ascii="Microsoft YaHei" w:hAnsi="Microsoft YaHei" w:eastAsia="Microsoft YaHei"/>
           <w:sz w:val="21"/>
         </w:rPr>
-        <w:t>科研成长日志是一款面向研究生、科研人员与工程师的个人成长记录工具。它以结构化日志沉淀科研、学习与工程实践过程，帮助用户记录每日产出、问题与下一步行动，逐步形成可回顾的长期成长轨迹。</w:t>
+        <w:t>科研成长日志面向研究生、科研人员和工程师，用结构化日志记录每天完成的事项、遇到的问题和下一步计划。产品强调轻量记录、个人数据边界和可持续回顾，帮助用户在长期科研或工程活动中保留可检索的工作轨迹。</w:t>
+      </w:r>
+    </w:p>
+    <w:p>
+      <w:r>
+        <w:rPr>
+          <w:rFonts w:ascii="Microsoft YaHei" w:hAnsi="Microsoft YaHei" w:eastAsia="Microsoft YaHei"/>
+          <w:sz w:val="21"/>
+        </w:rPr>
+        <w:t>当前版本是多人系统，但仍以个人使用为核心。用户之间不共享 Diary，也没有团队协作或公开内容。</w:t>
       </w:r>
     </w:p>
     <w:p>
       <w:pPr>
         <w:pStyle w:val="Heading1"/>
-        <w:spacing w:before="280" w:after="120"/>
+        <w:keepNext/>
       </w:pPr>
       <w:r>
-        <w:rPr>
-          <w:rFonts w:ascii="Aptos" w:hAnsi="Aptos" w:eastAsia="Microsoft YaHei"/>
-          <w:b/>
-          <w:color w:val="000000"/>
-          <w:sz w:val="30"/>
-        </w:rPr>
         <w:t>2 目标用户</w:t>
       </w:r>
     </w:p>
     <w:p>
       <w:pPr>
         <w:pStyle w:val="ListBullet"/>
-        <w:spacing w:after="80" w:line="300" w:lineRule="auto"/>
+        <w:keepLines/>
       </w:pPr>
       <w:r>
         <w:rPr>
-          <w:rFonts w:ascii="Aptos" w:hAnsi="Aptos" w:eastAsia="Microsoft YaHei"/>
-          <w:color w:val="000000"/>
+          <w:rFonts w:ascii="Microsoft YaHei" w:hAnsi="Microsoft YaHei" w:eastAsia="Microsoft YaHei"/>
           <w:sz w:val="21"/>
         </w:rPr>
-        <w:t>研究生：记录实验、文献阅读、论文写作与阶段性困惑。</w:t>
+        <w:t>研究生：记录实验、文献阅读、论文写作、阶段性产出和待解决问题。</w:t>
       </w:r>
     </w:p>
     <w:p>
       <w:pPr>
         <w:pStyle w:val="ListBullet"/>
-        <w:spacing w:after="80" w:line="300" w:lineRule="auto"/>
+        <w:keepLines/>
       </w:pPr>
       <w:r>
         <w:rPr>
-          <w:rFonts w:ascii="Aptos" w:hAnsi="Aptos" w:eastAsia="Microsoft YaHei"/>
-          <w:color w:val="000000"/>
+          <w:rFonts w:ascii="Microsoft YaHei" w:hAnsi="Microsoft YaHei" w:eastAsia="Microsoft YaHei"/>
           <w:sz w:val="21"/>
         </w:rPr>
-        <w:t>科研人员：沉淀研究推进过程、关键决策和问题解决路径。</w:t>
+        <w:t>科研人员：沉淀研究推进过程、关键决策、问题处理路径和后续行动。</w:t>
       </w:r>
     </w:p>
     <w:p>
       <w:pPr>
         <w:pStyle w:val="ListBullet"/>
-        <w:spacing w:after="80" w:line="300" w:lineRule="auto"/>
+        <w:keepLines/>
       </w:pPr>
       <w:r>
         <w:rPr>
-          <w:rFonts w:ascii="Aptos" w:hAnsi="Aptos" w:eastAsia="Microsoft YaHei"/>
-          <w:color w:val="000000"/>
+          <w:rFonts w:ascii="Microsoft YaHei" w:hAnsi="Microsoft YaHei" w:eastAsia="Microsoft YaHei"/>
           <w:sz w:val="21"/>
         </w:rPr>
-        <w:t>工程师：记录技术学习、项目进展和待解决事项。</w:t>
+        <w:t>工程师：记录技术学习、项目进展、故障排查和第二天的工作计划。</w:t>
       </w:r>
     </w:p>
     <w:p>
       <w:pPr>
         <w:pStyle w:val="Heading1"/>
-        <w:spacing w:before="280" w:after="120"/>
+        <w:keepNext/>
       </w:pPr>
       <w:r>
-        <w:rPr>
-          <w:rFonts w:ascii="Aptos" w:hAnsi="Aptos" w:eastAsia="Microsoft YaHei"/>
-          <w:b/>
-          <w:color w:val="000000"/>
-          <w:sz w:val="30"/>
-        </w:rPr>
-        <w:t>3 核心使用场景</w:t>
+        <w:t>3 核心使用流程</w:t>
       </w:r>
     </w:p>
     <w:p>
-      <w:pPr>
-        <w:spacing w:after="140" w:line="324" w:lineRule="auto"/>
-      </w:pPr>
       <w:r>
         <w:rPr>
-          <w:rFonts w:ascii="Aptos" w:hAnsi="Aptos" w:eastAsia="Microsoft YaHei"/>
-          <w:b w:val="0"/>
-          <w:color w:val="000000"/>
+          <w:rFonts w:ascii="Microsoft YaHei" w:hAnsi="Microsoft YaHei" w:eastAsia="Microsoft YaHei"/>
           <w:sz w:val="21"/>
         </w:rPr>
-        <w:t>用户在一天结束时创建当天日志，填写完成事项、遇到的问题以及下一步计划。需要复盘时，用户可按时间浏览历史记录，或用关键词找回某项实验、技术问题、论文主题或项目经历。</w:t>
+        <w:t>新用户先注册并登录。系统根据用户设置的 IANA 时区判断当天日期，然后在 Dashboard 展示今日记录状态和最近三篇日志。用户可以创建或继续编辑今日日志，也可以浏览历史、搜索过去的内容、查看单篇详情，并在设置页修改用户名和时区。Session 在页面刷新后继续有效，退出后停止访问个人数据。</w:t>
       </w:r>
     </w:p>
     <w:p>
       <w:pPr>
         <w:pStyle w:val="Heading1"/>
-        <w:spacing w:before="280" w:after="120"/>
+        <w:keepNext/>
       </w:pPr>
       <w:r>
-        <w:rPr>
-          <w:rFonts w:ascii="Aptos" w:hAnsi="Aptos" w:eastAsia="Microsoft YaHei"/>
-          <w:b/>
-          <w:color w:val="000000"/>
-          <w:sz w:val="30"/>
-        </w:rPr>
-        <w:t>4 MVP 功能范围</w:t>
+        <w:t>4 当前产品能力</w:t>
       </w:r>
     </w:p>
     <w:tbl>
       <w:tblPr>
-        <w:tblStyle w:val="TableGrid"/>
-        <w:tblW w:type="auto" w:w="0"/>
+        <w:tblW w:type="dxa" w:w="9576"/>
         <w:jc w:val="center"/>
         <w:tblLayout w:type="fixed"/>
         <w:tblLook w:firstColumn="1" w:firstRow="1" w:lastColumn="0" w:lastRow="0" w:noHBand="0" w:noVBand="1" w:val="04A0"/>
+        <w:tblBorders>
+          <w:top w:val="single" w:sz="6" w:space="0" w:color="D9D9D9"/>
+          <w:left w:val="single" w:sz="6" w:space="0" w:color="D9D9D9"/>
+          <w:bottom w:val="single" w:sz="6" w:space="0" w:color="D9D9D9"/>
+          <w:right w:val="single" w:sz="6" w:space="0" w:color="D9D9D9"/>
+          <w:insideH w:val="single" w:sz="6" w:space="0" w:color="D9D9D9"/>
+          <w:insideV w:val="single" w:sz="6" w:space="0" w:color="D9D9D9"/>
+        </w:tblBorders>
       </w:tblPr>
       <w:tblGrid>
-        <w:gridCol w:w="2268"/>
-        <w:gridCol w:w="6236"/>
+        <w:gridCol w:w="1800"/>
+        <w:gridCol w:w="6408"/>
+        <w:gridCol w:w="1368"/>
       </w:tblGrid>
       <w:tr>
+        <w:trPr>
+          <w:tblHeader w:val="true"/>
+          <w:cantSplit/>
+        </w:trPr>
         <w:tc>
           <w:tcPr>
-            <w:tcW w:type="dxa" w:w="4703"/>
-            <w:shd w:fill="1F4E79"/>
-            <w:tcBorders>
-              <w:top w:val="single" w:sz="6" w:color="D9D9D9"/>
-              <w:left w:val="single" w:sz="6" w:color="D9D9D9"/>
-              <w:bottom w:val="single" w:sz="6" w:color="D9D9D9"/>
-              <w:right w:val="single" w:sz="6" w:color="D9D9D9"/>
-            </w:tcBorders>
+            <w:tcW w:type="dxa" w:w="1800"/>
+            <w:shd w:fill="1F4E78"/>
+            <w:tcMar>
+              <w:top w:w="110" w:type="dxa"/>
+              <w:start w:w="130" w:type="dxa"/>
+              <w:bottom w:w="110" w:type="dxa"/>
+              <w:end w:w="130" w:type="dxa"/>
+            </w:tcMar>
             <w:vAlign w:val="center"/>
           </w:tcPr>
           <w:p>
             <w:pPr>
+              <w:spacing w:after="0"/>
               <w:jc w:val="center"/>
             </w:pPr>
             <w:r>
               <w:rPr>
-                <w:rFonts w:ascii="Aptos" w:hAnsi="Aptos" w:eastAsia="Microsoft YaHei"/>
+                <w:rFonts w:ascii="Microsoft YaHei" w:hAnsi="Microsoft YaHei" w:eastAsia="Microsoft YaHei"/>
                 <w:b/>
                 <w:color w:val="FFFFFF"/>
-                <w:sz w:val="21"/>
+                <w:sz w:val="19"/>
               </w:rPr>
-              <w:t>功能模块</w:t>
+              <w:t>模块</w:t>
             </w:r>
           </w:p>
         </w:tc>
         <w:tc>
           <w:tcPr>
-            <w:tcW w:type="dxa" w:w="4703"/>
-            <w:shd w:fill="1F4E79"/>
-            <w:tcBorders>
-              <w:top w:val="single" w:sz="6" w:color="D9D9D9"/>
-              <w:left w:val="single" w:sz="6" w:color="D9D9D9"/>
-              <w:bottom w:val="single" w:sz="6" w:color="D9D9D9"/>
-              <w:right w:val="single" w:sz="6" w:color="D9D9D9"/>
-            </w:tcBorders>
+            <w:tcW w:type="dxa" w:w="6408"/>
+            <w:shd w:fill="1F4E78"/>
+            <w:tcMar>
+              <w:top w:w="110" w:type="dxa"/>
+              <w:start w:w="130" w:type="dxa"/>
+              <w:bottom w:w="110" w:type="dxa"/>
+              <w:end w:w="130" w:type="dxa"/>
+            </w:tcMar>
             <w:vAlign w:val="center"/>
           </w:tcPr>
           <w:p>
             <w:pPr>
+              <w:spacing w:after="0"/>
               <w:jc w:val="center"/>
             </w:pPr>
             <w:r>
               <w:rPr>
-                <w:rFonts w:ascii="Aptos" w:hAnsi="Aptos" w:eastAsia="Microsoft YaHei"/>
+                <w:rFonts w:ascii="Microsoft YaHei" w:hAnsi="Microsoft YaHei" w:eastAsia="Microsoft YaHei"/>
                 <w:b/>
                 <w:color w:val="FFFFFF"/>
-                <w:sz w:val="21"/>
+                <w:sz w:val="19"/>
               </w:rPr>
-              <w:t>主要能力</w:t>
+              <w:t>当前能力</w:t>
+            </w:r>
+          </w:p>
+        </w:tc>
+        <w:tc>
+          <w:tcPr>
+            <w:tcW w:type="dxa" w:w="1368"/>
+            <w:shd w:fill="1F4E78"/>
+            <w:tcMar>
+              <w:top w:w="110" w:type="dxa"/>
+              <w:start w:w="130" w:type="dxa"/>
+              <w:bottom w:w="110" w:type="dxa"/>
+              <w:end w:w="130" w:type="dxa"/>
+            </w:tcMar>
+            <w:vAlign w:val="center"/>
+          </w:tcPr>
+          <w:p>
+            <w:pPr>
+              <w:spacing w:after="0"/>
+              <w:jc w:val="center"/>
+            </w:pPr>
+            <w:r>
+              <w:rPr>
+                <w:rFonts w:ascii="Microsoft YaHei" w:hAnsi="Microsoft YaHei" w:eastAsia="Microsoft YaHei"/>
+                <w:b/>
+                <w:color w:val="FFFFFF"/>
+                <w:sz w:val="19"/>
+              </w:rPr>
+              <w:t>状态</w:t>
             </w:r>
           </w:p>
         </w:tc>
       </w:tr>
       <w:tr>
+        <w:trPr>
+          <w:cantSplit/>
+        </w:trPr>
         <w:tc>
           <w:tcPr>
-            <w:tcW w:type="dxa" w:w="2268"/>
-            <w:tcBorders>
-              <w:top w:val="single" w:sz="6" w:color="D9D9D9"/>
-              <w:left w:val="single" w:sz="6" w:color="D9D9D9"/>
-              <w:bottom w:val="single" w:sz="6" w:color="D9D9D9"/>
-              <w:right w:val="single" w:sz="6" w:color="D9D9D9"/>
-            </w:tcBorders>
+            <w:tcW w:type="dxa" w:w="1800"/>
+            <w:tcMar>
+              <w:top w:w="110" w:type="dxa"/>
+              <w:start w:w="130" w:type="dxa"/>
+              <w:bottom w:w="110" w:type="dxa"/>
+              <w:end w:w="130" w:type="dxa"/>
+            </w:tcMar>
             <w:vAlign w:val="center"/>
           </w:tcPr>
           <w:p>
             <w:pPr>
-              <w:spacing w:after="60" w:before="60"/>
+              <w:spacing w:after="0" w:line="276" w:lineRule="auto"/>
+              <w:jc w:val="center"/>
             </w:pPr>
             <w:r>
               <w:rPr>
-                <w:rFonts w:ascii="Aptos" w:hAnsi="Aptos" w:eastAsia="Microsoft YaHei"/>
-                <w:b/>
+                <w:rFonts w:ascii="Microsoft YaHei" w:hAnsi="Microsoft YaHei" w:eastAsia="Microsoft YaHei"/>
                 <w:color w:val="000000"/>
-                <w:sz w:val="20"/>
+                <w:sz w:val="18"/>
               </w:rPr>
-              <w:t>日志记录</w:t>
+              <w:t>用户认证</w:t>
             </w:r>
           </w:p>
         </w:tc>
         <w:tc>
           <w:tcPr>
-            <w:tcW w:type="dxa" w:w="6236"/>
-            <w:tcBorders>
-              <w:top w:val="single" w:sz="6" w:color="D9D9D9"/>
-              <w:left w:val="single" w:sz="6" w:color="D9D9D9"/>
-              <w:bottom w:val="single" w:sz="6" w:color="D9D9D9"/>
-              <w:right w:val="single" w:sz="6" w:color="D9D9D9"/>
-            </w:tcBorders>
+            <w:tcW w:type="dxa" w:w="6408"/>
+            <w:tcMar>
+              <w:top w:w="110" w:type="dxa"/>
+              <w:start w:w="130" w:type="dxa"/>
+              <w:bottom w:w="110" w:type="dxa"/>
+              <w:end w:w="130" w:type="dxa"/>
+            </w:tcMar>
             <w:vAlign w:val="center"/>
           </w:tcPr>
           <w:p>
             <w:pPr>
-              <w:spacing w:after="60" w:before="60"/>
+              <w:spacing w:after="0" w:line="276" w:lineRule="auto"/>
+              <w:jc w:val="left"/>
             </w:pPr>
             <w:r>
               <w:rPr>
-                <w:rFonts w:ascii="Aptos" w:hAnsi="Aptos" w:eastAsia="Microsoft YaHei"/>
-                <w:b w:val="0"/>
+                <w:rFonts w:ascii="Microsoft YaHei" w:hAnsi="Microsoft YaHei" w:eastAsia="Microsoft YaHei"/>
                 <w:color w:val="000000"/>
-                <w:sz w:val="20"/>
+                <w:sz w:val="18"/>
               </w:rPr>
-              <w:t>创建和编辑当天日志；记录完成事项、问题、下一步计划及可选补充内容；同一用户每天只保留一篇日志。</w:t>
+              <w:t>邮箱密码注册、登录、退出和当前用户识别；Session 持久化。</w:t>
+            </w:r>
+          </w:p>
+        </w:tc>
+        <w:tc>
+          <w:tcPr>
+            <w:tcW w:type="dxa" w:w="1368"/>
+            <w:tcMar>
+              <w:top w:w="110" w:type="dxa"/>
+              <w:start w:w="130" w:type="dxa"/>
+              <w:bottom w:w="110" w:type="dxa"/>
+              <w:end w:w="130" w:type="dxa"/>
+            </w:tcMar>
+            <w:vAlign w:val="center"/>
+          </w:tcPr>
+          <w:p>
+            <w:pPr>
+              <w:spacing w:after="0" w:line="276" w:lineRule="auto"/>
+              <w:jc w:val="center"/>
+            </w:pPr>
+            <w:r>
+              <w:rPr>
+                <w:rFonts w:ascii="Microsoft YaHei" w:hAnsi="Microsoft YaHei" w:eastAsia="Microsoft YaHei"/>
+                <w:color w:val="000000"/>
+                <w:sz w:val="18"/>
+              </w:rPr>
+              <w:t>已完成</w:t>
             </w:r>
           </w:p>
         </w:tc>
       </w:tr>
       <w:tr>
+        <w:trPr>
+          <w:cantSplit/>
+        </w:trPr>
         <w:tc>
           <w:tcPr>
-            <w:tcW w:type="dxa" w:w="2268"/>
-            <w:tcBorders>
-              <w:top w:val="single" w:sz="6" w:color="D9D9D9"/>
-              <w:left w:val="single" w:sz="6" w:color="D9D9D9"/>
-              <w:bottom w:val="single" w:sz="6" w:color="D9D9D9"/>
-              <w:right w:val="single" w:sz="6" w:color="D9D9D9"/>
-            </w:tcBorders>
+            <w:tcW w:type="dxa" w:w="1800"/>
             <w:shd w:fill="F3F7FA"/>
+            <w:tcMar>
+              <w:top w:w="110" w:type="dxa"/>
+              <w:start w:w="130" w:type="dxa"/>
+              <w:bottom w:w="110" w:type="dxa"/>
+              <w:end w:w="130" w:type="dxa"/>
+            </w:tcMar>
             <w:vAlign w:val="center"/>
           </w:tcPr>
           <w:p>
             <w:pPr>
-              <w:spacing w:after="60" w:before="60"/>
+              <w:spacing w:after="0" w:line="276" w:lineRule="auto"/>
+              <w:jc w:val="center"/>
             </w:pPr>
             <w:r>
               <w:rPr>
-                <w:rFonts w:ascii="Aptos" w:hAnsi="Aptos" w:eastAsia="Microsoft YaHei"/>
-                <w:b/>
+                <w:rFonts w:ascii="Microsoft YaHei" w:hAnsi="Microsoft YaHei" w:eastAsia="Microsoft YaHei"/>
                 <w:color w:val="000000"/>
-                <w:sz w:val="20"/>
+                <w:sz w:val="18"/>
               </w:rPr>
-              <w:t>日志保存</w:t>
+              <w:t>个人 Dashboard</w:t>
             </w:r>
           </w:p>
         </w:tc>
         <w:tc>
           <w:tcPr>
-            <w:tcW w:type="dxa" w:w="6236"/>
-            <w:tcBorders>
-              <w:top w:val="single" w:sz="6" w:color="D9D9D9"/>
-              <w:left w:val="single" w:sz="6" w:color="D9D9D9"/>
-              <w:bottom w:val="single" w:sz="6" w:color="D9D9D9"/>
-              <w:right w:val="single" w:sz="6" w:color="D9D9D9"/>
-            </w:tcBorders>
+            <w:tcW w:type="dxa" w:w="6408"/>
             <w:shd w:fill="F3F7FA"/>
+            <w:tcMar>
+              <w:top w:w="110" w:type="dxa"/>
+              <w:start w:w="130" w:type="dxa"/>
+              <w:bottom w:w="110" w:type="dxa"/>
+              <w:end w:w="130" w:type="dxa"/>
+            </w:tcMar>
             <w:vAlign w:val="center"/>
           </w:tcPr>
           <w:p>
             <w:pPr>
-              <w:spacing w:after="60" w:before="60"/>
+              <w:spacing w:after="0" w:line="276" w:lineRule="auto"/>
+              <w:jc w:val="left"/>
             </w:pPr>
             <w:r>
               <w:rPr>
-                <w:rFonts w:ascii="Aptos" w:hAnsi="Aptos" w:eastAsia="Microsoft YaHei"/>
-                <w:b w:val="0"/>
+                <w:rFonts w:ascii="Microsoft YaHei" w:hAnsi="Microsoft YaHei" w:eastAsia="Microsoft YaHei"/>
                 <w:color w:val="000000"/>
-                <w:sz w:val="20"/>
+                <w:sz w:val="18"/>
               </w:rPr>
-              <w:t>保存后支持继续修改；记录创建与更新时间，确保内容可持续维护。</w:t>
+              <w:t>显示用户名、用户时区下的当前日期、今日日志状态、最近三篇日志和快捷入口。</w:t>
+            </w:r>
+          </w:p>
+        </w:tc>
+        <w:tc>
+          <w:tcPr>
+            <w:tcW w:type="dxa" w:w="1368"/>
+            <w:shd w:fill="F3F7FA"/>
+            <w:tcMar>
+              <w:top w:w="110" w:type="dxa"/>
+              <w:start w:w="130" w:type="dxa"/>
+              <w:bottom w:w="110" w:type="dxa"/>
+              <w:end w:w="130" w:type="dxa"/>
+            </w:tcMar>
+            <w:vAlign w:val="center"/>
+          </w:tcPr>
+          <w:p>
+            <w:pPr>
+              <w:spacing w:after="0" w:line="276" w:lineRule="auto"/>
+              <w:jc w:val="center"/>
+            </w:pPr>
+            <w:r>
+              <w:rPr>
+                <w:rFonts w:ascii="Microsoft YaHei" w:hAnsi="Microsoft YaHei" w:eastAsia="Microsoft YaHei"/>
+                <w:color w:val="000000"/>
+                <w:sz w:val="18"/>
+              </w:rPr>
+              <w:t>已完成</w:t>
             </w:r>
           </w:p>
         </w:tc>
       </w:tr>
       <w:tr>
+        <w:trPr>
+          <w:cantSplit/>
+        </w:trPr>
         <w:tc>
           <w:tcPr>
-            <w:tcW w:type="dxa" w:w="2268"/>
-            <w:tcBorders>
-              <w:top w:val="single" w:sz="6" w:color="D9D9D9"/>
-              <w:left w:val="single" w:sz="6" w:color="D9D9D9"/>
-              <w:bottom w:val="single" w:sz="6" w:color="D9D9D9"/>
-              <w:right w:val="single" w:sz="6" w:color="D9D9D9"/>
-            </w:tcBorders>
+            <w:tcW w:type="dxa" w:w="1800"/>
+            <w:tcMar>
+              <w:top w:w="110" w:type="dxa"/>
+              <w:start w:w="130" w:type="dxa"/>
+              <w:bottom w:w="110" w:type="dxa"/>
+              <w:end w:w="130" w:type="dxa"/>
+            </w:tcMar>
             <w:vAlign w:val="center"/>
           </w:tcPr>
           <w:p>
             <w:pPr>
-              <w:spacing w:after="60" w:before="60"/>
+              <w:spacing w:after="0" w:line="276" w:lineRule="auto"/>
+              <w:jc w:val="center"/>
             </w:pPr>
             <w:r>
               <w:rPr>
-                <w:rFonts w:ascii="Aptos" w:hAnsi="Aptos" w:eastAsia="Microsoft YaHei"/>
-                <w:b/>
+                <w:rFonts w:ascii="Microsoft YaHei" w:hAnsi="Microsoft YaHei" w:eastAsia="Microsoft YaHei"/>
                 <w:color w:val="000000"/>
-                <w:sz w:val="20"/>
+                <w:sz w:val="18"/>
               </w:rPr>
-              <w:t>历史回顾</w:t>
+              <w:t>今日日志</w:t>
             </w:r>
           </w:p>
         </w:tc>
         <w:tc>
           <w:tcPr>
-            <w:tcW w:type="dxa" w:w="6236"/>
-            <w:tcBorders>
-              <w:top w:val="single" w:sz="6" w:color="D9D9D9"/>
-              <w:left w:val="single" w:sz="6" w:color="D9D9D9"/>
-              <w:bottom w:val="single" w:sz="6" w:color="D9D9D9"/>
-              <w:right w:val="single" w:sz="6" w:color="D9D9D9"/>
-            </w:tcBorders>
+            <w:tcW w:type="dxa" w:w="6408"/>
+            <w:tcMar>
+              <w:top w:w="110" w:type="dxa"/>
+              <w:start w:w="130" w:type="dxa"/>
+              <w:bottom w:w="110" w:type="dxa"/>
+              <w:end w:w="130" w:type="dxa"/>
+            </w:tcMar>
             <w:vAlign w:val="center"/>
           </w:tcPr>
           <w:p>
             <w:pPr>
-              <w:spacing w:after="60" w:before="60"/>
+              <w:spacing w:after="0" w:line="276" w:lineRule="auto"/>
+              <w:jc w:val="left"/>
             </w:pPr>
             <w:r>
               <w:rPr>
-                <w:rFonts w:ascii="Aptos" w:hAnsi="Aptos" w:eastAsia="Microsoft YaHei"/>
-                <w:b w:val="0"/>
+                <w:rFonts w:ascii="Microsoft YaHei" w:hAnsi="Microsoft YaHei" w:eastAsia="Microsoft YaHei"/>
                 <w:color w:val="000000"/>
-                <w:sz w:val="20"/>
+                <w:sz w:val="18"/>
               </w:rPr>
-              <w:t>按日期倒序展示历史日志；进入详情页查看和编辑单篇日志。</w:t>
+              <w:t>创建或更新当天日志；记录完成事项、遇到问题和下一步计划；同一用户每天一篇。</w:t>
+            </w:r>
+          </w:p>
+        </w:tc>
+        <w:tc>
+          <w:tcPr>
+            <w:tcW w:type="dxa" w:w="1368"/>
+            <w:tcMar>
+              <w:top w:w="110" w:type="dxa"/>
+              <w:start w:w="130" w:type="dxa"/>
+              <w:bottom w:w="110" w:type="dxa"/>
+              <w:end w:w="130" w:type="dxa"/>
+            </w:tcMar>
+            <w:vAlign w:val="center"/>
+          </w:tcPr>
+          <w:p>
+            <w:pPr>
+              <w:spacing w:after="0" w:line="276" w:lineRule="auto"/>
+              <w:jc w:val="center"/>
+            </w:pPr>
+            <w:r>
+              <w:rPr>
+                <w:rFonts w:ascii="Microsoft YaHei" w:hAnsi="Microsoft YaHei" w:eastAsia="Microsoft YaHei"/>
+                <w:color w:val="000000"/>
+                <w:sz w:val="18"/>
+              </w:rPr>
+              <w:t>已完成</w:t>
             </w:r>
           </w:p>
         </w:tc>
       </w:tr>
       <w:tr>
+        <w:trPr>
+          <w:cantSplit/>
+        </w:trPr>
         <w:tc>
           <w:tcPr>
-            <w:tcW w:type="dxa" w:w="2268"/>
-            <w:tcBorders>
-              <w:top w:val="single" w:sz="6" w:color="D9D9D9"/>
-              <w:left w:val="single" w:sz="6" w:color="D9D9D9"/>
-              <w:bottom w:val="single" w:sz="6" w:color="D9D9D9"/>
-              <w:right w:val="single" w:sz="6" w:color="D9D9D9"/>
-            </w:tcBorders>
+            <w:tcW w:type="dxa" w:w="1800"/>
             <w:shd w:fill="F3F7FA"/>
+            <w:tcMar>
+              <w:top w:w="110" w:type="dxa"/>
+              <w:start w:w="130" w:type="dxa"/>
+              <w:bottom w:w="110" w:type="dxa"/>
+              <w:end w:w="130" w:type="dxa"/>
+            </w:tcMar>
             <w:vAlign w:val="center"/>
           </w:tcPr>
           <w:p>
             <w:pPr>
-              <w:spacing w:after="60" w:before="60"/>
+              <w:spacing w:after="0" w:line="276" w:lineRule="auto"/>
+              <w:jc w:val="center"/>
             </w:pPr>
             <w:r>
               <w:rPr>
-                <w:rFonts w:ascii="Aptos" w:hAnsi="Aptos" w:eastAsia="Microsoft YaHei"/>
-                <w:b/>
+                <w:rFonts w:ascii="Microsoft YaHei" w:hAnsi="Microsoft YaHei" w:eastAsia="Microsoft YaHei"/>
                 <w:color w:val="000000"/>
-                <w:sz w:val="20"/>
+                <w:sz w:val="18"/>
               </w:rPr>
-              <w:t>内容搜索</w:t>
+              <w:t>历史与详情</w:t>
             </w:r>
           </w:p>
         </w:tc>
         <w:tc>
           <w:tcPr>
-            <w:tcW w:type="dxa" w:w="6236"/>
-            <w:tcBorders>
-              <w:top w:val="single" w:sz="6" w:color="D9D9D9"/>
-              <w:left w:val="single" w:sz="6" w:color="D9D9D9"/>
-              <w:bottom w:val="single" w:sz="6" w:color="D9D9D9"/>
-              <w:right w:val="single" w:sz="6" w:color="D9D9D9"/>
-            </w:tcBorders>
+            <w:tcW w:type="dxa" w:w="6408"/>
             <w:shd w:fill="F3F7FA"/>
+            <w:tcMar>
+              <w:top w:w="110" w:type="dxa"/>
+              <w:start w:w="130" w:type="dxa"/>
+              <w:bottom w:w="110" w:type="dxa"/>
+              <w:end w:w="130" w:type="dxa"/>
+            </w:tcMar>
             <w:vAlign w:val="center"/>
           </w:tcPr>
           <w:p>
             <w:pPr>
-              <w:spacing w:after="60" w:before="60"/>
+              <w:spacing w:after="0" w:line="276" w:lineRule="auto"/>
+              <w:jc w:val="left"/>
             </w:pPr>
             <w:r>
               <w:rPr>
-                <w:rFonts w:ascii="Aptos" w:hAnsi="Aptos" w:eastAsia="Microsoft YaHei"/>
-                <w:b w:val="0"/>
+                <w:rFonts w:ascii="Microsoft YaHei" w:hAnsi="Microsoft YaHei" w:eastAsia="Microsoft YaHei"/>
                 <w:color w:val="000000"/>
-                <w:sz w:val="20"/>
+                <w:sz w:val="18"/>
               </w:rPr>
-              <w:t>以关键词检索完成事项、问题、计划和补充内容；结果展示日期与内容摘要。</w:t>
+              <w:t>按日期倒序浏览当前用户日志；详情页显示单篇完整内容。</w:t>
+            </w:r>
+          </w:p>
+        </w:tc>
+        <w:tc>
+          <w:tcPr>
+            <w:tcW w:type="dxa" w:w="1368"/>
+            <w:shd w:fill="F3F7FA"/>
+            <w:tcMar>
+              <w:top w:w="110" w:type="dxa"/>
+              <w:start w:w="130" w:type="dxa"/>
+              <w:bottom w:w="110" w:type="dxa"/>
+              <w:end w:w="130" w:type="dxa"/>
+            </w:tcMar>
+            <w:vAlign w:val="center"/>
+          </w:tcPr>
+          <w:p>
+            <w:pPr>
+              <w:spacing w:after="0" w:line="276" w:lineRule="auto"/>
+              <w:jc w:val="center"/>
+            </w:pPr>
+            <w:r>
+              <w:rPr>
+                <w:rFonts w:ascii="Microsoft YaHei" w:hAnsi="Microsoft YaHei" w:eastAsia="Microsoft YaHei"/>
+                <w:color w:val="000000"/>
+                <w:sz w:val="18"/>
+              </w:rPr>
+              <w:t>已完成</w:t>
+            </w:r>
+          </w:p>
+        </w:tc>
+      </w:tr>
+      <w:tr>
+        <w:trPr>
+          <w:cantSplit/>
+        </w:trPr>
+        <w:tc>
+          <w:tcPr>
+            <w:tcW w:type="dxa" w:w="1800"/>
+            <w:tcMar>
+              <w:top w:w="110" w:type="dxa"/>
+              <w:start w:w="130" w:type="dxa"/>
+              <w:bottom w:w="110" w:type="dxa"/>
+              <w:end w:w="130" w:type="dxa"/>
+            </w:tcMar>
+            <w:vAlign w:val="center"/>
+          </w:tcPr>
+          <w:p>
+            <w:pPr>
+              <w:spacing w:after="0" w:line="276" w:lineRule="auto"/>
+              <w:jc w:val="center"/>
+            </w:pPr>
+            <w:r>
+              <w:rPr>
+                <w:rFonts w:ascii="Microsoft YaHei" w:hAnsi="Microsoft YaHei" w:eastAsia="Microsoft YaHei"/>
+                <w:color w:val="000000"/>
+                <w:sz w:val="18"/>
+              </w:rPr>
+              <w:t>日志搜索</w:t>
+            </w:r>
+          </w:p>
+        </w:tc>
+        <w:tc>
+          <w:tcPr>
+            <w:tcW w:type="dxa" w:w="6408"/>
+            <w:tcMar>
+              <w:top w:w="110" w:type="dxa"/>
+              <w:start w:w="130" w:type="dxa"/>
+              <w:bottom w:w="110" w:type="dxa"/>
+              <w:end w:w="130" w:type="dxa"/>
+            </w:tcMar>
+            <w:vAlign w:val="center"/>
+          </w:tcPr>
+          <w:p>
+            <w:pPr>
+              <w:spacing w:after="0" w:line="276" w:lineRule="auto"/>
+              <w:jc w:val="left"/>
+            </w:pPr>
+            <w:r>
+              <w:rPr>
+                <w:rFonts w:ascii="Microsoft YaHei" w:hAnsi="Microsoft YaHei" w:eastAsia="Microsoft YaHei"/>
+                <w:color w:val="000000"/>
+                <w:sz w:val="18"/>
+              </w:rPr>
+              <w:t>在当前用户范围内检索完成事项、问题和下一步计划，并进入详情。</w:t>
+            </w:r>
+          </w:p>
+        </w:tc>
+        <w:tc>
+          <w:tcPr>
+            <w:tcW w:type="dxa" w:w="1368"/>
+            <w:tcMar>
+              <w:top w:w="110" w:type="dxa"/>
+              <w:start w:w="130" w:type="dxa"/>
+              <w:bottom w:w="110" w:type="dxa"/>
+              <w:end w:w="130" w:type="dxa"/>
+            </w:tcMar>
+            <w:vAlign w:val="center"/>
+          </w:tcPr>
+          <w:p>
+            <w:pPr>
+              <w:spacing w:after="0" w:line="276" w:lineRule="auto"/>
+              <w:jc w:val="center"/>
+            </w:pPr>
+            <w:r>
+              <w:rPr>
+                <w:rFonts w:ascii="Microsoft YaHei" w:hAnsi="Microsoft YaHei" w:eastAsia="Microsoft YaHei"/>
+                <w:color w:val="000000"/>
+                <w:sz w:val="18"/>
+              </w:rPr>
+              <w:t>已完成</w:t>
+            </w:r>
+          </w:p>
+        </w:tc>
+      </w:tr>
+      <w:tr>
+        <w:trPr>
+          <w:cantSplit/>
+        </w:trPr>
+        <w:tc>
+          <w:tcPr>
+            <w:tcW w:type="dxa" w:w="1800"/>
+            <w:shd w:fill="F3F7FA"/>
+            <w:tcMar>
+              <w:top w:w="110" w:type="dxa"/>
+              <w:start w:w="130" w:type="dxa"/>
+              <w:bottom w:w="110" w:type="dxa"/>
+              <w:end w:w="130" w:type="dxa"/>
+            </w:tcMar>
+            <w:vAlign w:val="center"/>
+          </w:tcPr>
+          <w:p>
+            <w:pPr>
+              <w:spacing w:after="0" w:line="276" w:lineRule="auto"/>
+              <w:jc w:val="center"/>
+            </w:pPr>
+            <w:r>
+              <w:rPr>
+                <w:rFonts w:ascii="Microsoft YaHei" w:hAnsi="Microsoft YaHei" w:eastAsia="Microsoft YaHei"/>
+                <w:color w:val="000000"/>
+                <w:sz w:val="18"/>
+              </w:rPr>
+              <w:t>个人设置</w:t>
+            </w:r>
+          </w:p>
+        </w:tc>
+        <w:tc>
+          <w:tcPr>
+            <w:tcW w:type="dxa" w:w="6408"/>
+            <w:shd w:fill="F3F7FA"/>
+            <w:tcMar>
+              <w:top w:w="110" w:type="dxa"/>
+              <w:start w:w="130" w:type="dxa"/>
+              <w:bottom w:w="110" w:type="dxa"/>
+              <w:end w:w="130" w:type="dxa"/>
+            </w:tcMar>
+            <w:vAlign w:val="center"/>
+          </w:tcPr>
+          <w:p>
+            <w:pPr>
+              <w:spacing w:after="0" w:line="276" w:lineRule="auto"/>
+              <w:jc w:val="left"/>
+            </w:pPr>
+            <w:r>
+              <w:rPr>
+                <w:rFonts w:ascii="Microsoft YaHei" w:hAnsi="Microsoft YaHei" w:eastAsia="Microsoft YaHei"/>
+                <w:color w:val="000000"/>
+                <w:sz w:val="18"/>
+              </w:rPr>
+              <w:t>查看用户名、邮箱和时区；修改用户名与时区；邮箱暂时只读。</w:t>
+            </w:r>
+          </w:p>
+        </w:tc>
+        <w:tc>
+          <w:tcPr>
+            <w:tcW w:type="dxa" w:w="1368"/>
+            <w:shd w:fill="F3F7FA"/>
+            <w:tcMar>
+              <w:top w:w="110" w:type="dxa"/>
+              <w:start w:w="130" w:type="dxa"/>
+              <w:bottom w:w="110" w:type="dxa"/>
+              <w:end w:w="130" w:type="dxa"/>
+            </w:tcMar>
+            <w:vAlign w:val="center"/>
+          </w:tcPr>
+          <w:p>
+            <w:pPr>
+              <w:spacing w:after="0" w:line="276" w:lineRule="auto"/>
+              <w:jc w:val="center"/>
+            </w:pPr>
+            <w:r>
+              <w:rPr>
+                <w:rFonts w:ascii="Microsoft YaHei" w:hAnsi="Microsoft YaHei" w:eastAsia="Microsoft YaHei"/>
+                <w:color w:val="000000"/>
+                <w:sz w:val="18"/>
+              </w:rPr>
+              <w:t>已完成</w:t>
+            </w:r>
+          </w:p>
+        </w:tc>
+      </w:tr>
+      <w:tr>
+        <w:trPr>
+          <w:cantSplit/>
+        </w:trPr>
+        <w:tc>
+          <w:tcPr>
+            <w:tcW w:type="dxa" w:w="1800"/>
+            <w:tcMar>
+              <w:top w:w="110" w:type="dxa"/>
+              <w:start w:w="130" w:type="dxa"/>
+              <w:bottom w:w="110" w:type="dxa"/>
+              <w:end w:w="130" w:type="dxa"/>
+            </w:tcMar>
+            <w:vAlign w:val="center"/>
+          </w:tcPr>
+          <w:p>
+            <w:pPr>
+              <w:spacing w:after="0" w:line="276" w:lineRule="auto"/>
+              <w:jc w:val="center"/>
+            </w:pPr>
+            <w:r>
+              <w:rPr>
+                <w:rFonts w:ascii="Microsoft YaHei" w:hAnsi="Microsoft YaHei" w:eastAsia="Microsoft YaHei"/>
+                <w:color w:val="000000"/>
+                <w:sz w:val="18"/>
+              </w:rPr>
+              <w:t>用户隔离</w:t>
+            </w:r>
+          </w:p>
+        </w:tc>
+        <w:tc>
+          <w:tcPr>
+            <w:tcW w:type="dxa" w:w="6408"/>
+            <w:tcMar>
+              <w:top w:w="110" w:type="dxa"/>
+              <w:start w:w="130" w:type="dxa"/>
+              <w:bottom w:w="110" w:type="dxa"/>
+              <w:end w:w="130" w:type="dxa"/>
+            </w:tcMar>
+            <w:vAlign w:val="center"/>
+          </w:tcPr>
+          <w:p>
+            <w:pPr>
+              <w:spacing w:after="0" w:line="276" w:lineRule="auto"/>
+              <w:jc w:val="left"/>
+            </w:pPr>
+            <w:r>
+              <w:rPr>
+                <w:rFonts w:ascii="Microsoft YaHei" w:hAnsi="Microsoft YaHei" w:eastAsia="Microsoft YaHei"/>
+                <w:color w:val="000000"/>
+                <w:sz w:val="18"/>
+              </w:rPr>
+              <w:t>所有 Diary 查询使用服务端 Session 用户；其他用户的 Diary 详情返回 404。</w:t>
+            </w:r>
+          </w:p>
+        </w:tc>
+        <w:tc>
+          <w:tcPr>
+            <w:tcW w:type="dxa" w:w="1368"/>
+            <w:tcMar>
+              <w:top w:w="110" w:type="dxa"/>
+              <w:start w:w="130" w:type="dxa"/>
+              <w:bottom w:w="110" w:type="dxa"/>
+              <w:end w:w="130" w:type="dxa"/>
+            </w:tcMar>
+            <w:vAlign w:val="center"/>
+          </w:tcPr>
+          <w:p>
+            <w:pPr>
+              <w:spacing w:after="0" w:line="276" w:lineRule="auto"/>
+              <w:jc w:val="center"/>
+            </w:pPr>
+            <w:r>
+              <w:rPr>
+                <w:rFonts w:ascii="Microsoft YaHei" w:hAnsi="Microsoft YaHei" w:eastAsia="Microsoft YaHei"/>
+                <w:color w:val="000000"/>
+                <w:sz w:val="18"/>
+              </w:rPr>
+              <w:t>已完成</w:t>
+            </w:r>
+          </w:p>
+        </w:tc>
+      </w:tr>
+      <w:tr>
+        <w:trPr>
+          <w:cantSplit/>
+        </w:trPr>
+        <w:tc>
+          <w:tcPr>
+            <w:tcW w:type="dxa" w:w="1800"/>
+            <w:shd w:fill="F3F7FA"/>
+            <w:tcMar>
+              <w:top w:w="110" w:type="dxa"/>
+              <w:start w:w="130" w:type="dxa"/>
+              <w:bottom w:w="110" w:type="dxa"/>
+              <w:end w:w="130" w:type="dxa"/>
+            </w:tcMar>
+            <w:vAlign w:val="center"/>
+          </w:tcPr>
+          <w:p>
+            <w:pPr>
+              <w:spacing w:after="0" w:line="276" w:lineRule="auto"/>
+              <w:jc w:val="center"/>
+            </w:pPr>
+            <w:r>
+              <w:rPr>
+                <w:rFonts w:ascii="Microsoft YaHei" w:hAnsi="Microsoft YaHei" w:eastAsia="Microsoft YaHei"/>
+                <w:color w:val="000000"/>
+                <w:sz w:val="18"/>
+              </w:rPr>
+              <w:t>运行健康检查</w:t>
+            </w:r>
+          </w:p>
+        </w:tc>
+        <w:tc>
+          <w:tcPr>
+            <w:tcW w:type="dxa" w:w="6408"/>
+            <w:shd w:fill="F3F7FA"/>
+            <w:tcMar>
+              <w:top w:w="110" w:type="dxa"/>
+              <w:start w:w="130" w:type="dxa"/>
+              <w:bottom w:w="110" w:type="dxa"/>
+              <w:end w:w="130" w:type="dxa"/>
+            </w:tcMar>
+            <w:vAlign w:val="center"/>
+          </w:tcPr>
+          <w:p>
+            <w:pPr>
+              <w:spacing w:after="0" w:line="276" w:lineRule="auto"/>
+              <w:jc w:val="left"/>
+            </w:pPr>
+            <w:r>
+              <w:rPr>
+                <w:rFonts w:ascii="Microsoft YaHei" w:hAnsi="Microsoft YaHei" w:eastAsia="Microsoft YaHei"/>
+                <w:color w:val="000000"/>
+                <w:sz w:val="18"/>
+              </w:rPr>
+              <w:t>通过公开健康接口检查应用是否能够连接 PostgreSQL，不读取业务数据。</w:t>
+            </w:r>
+          </w:p>
+        </w:tc>
+        <w:tc>
+          <w:tcPr>
+            <w:tcW w:type="dxa" w:w="1368"/>
+            <w:shd w:fill="F3F7FA"/>
+            <w:tcMar>
+              <w:top w:w="110" w:type="dxa"/>
+              <w:start w:w="130" w:type="dxa"/>
+              <w:bottom w:w="110" w:type="dxa"/>
+              <w:end w:w="130" w:type="dxa"/>
+            </w:tcMar>
+            <w:vAlign w:val="center"/>
+          </w:tcPr>
+          <w:p>
+            <w:pPr>
+              <w:spacing w:after="0" w:line="276" w:lineRule="auto"/>
+              <w:jc w:val="center"/>
+            </w:pPr>
+            <w:r>
+              <w:rPr>
+                <w:rFonts w:ascii="Microsoft YaHei" w:hAnsi="Microsoft YaHei" w:eastAsia="Microsoft YaHei"/>
+                <w:color w:val="000000"/>
+                <w:sz w:val="18"/>
+              </w:rPr>
+              <w:t>已完成</w:t>
             </w:r>
           </w:p>
         </w:tc>
@@ -467,207 +946,2075 @@
     </w:tbl>
     <w:p>
       <w:pPr>
+        <w:spacing w:after="40"/>
+      </w:pPr>
+    </w:p>
+    <w:p>
+      <w:pPr>
         <w:pStyle w:val="Heading1"/>
-        <w:spacing w:before="280" w:after="120"/>
+        <w:keepNext/>
       </w:pPr>
       <w:r>
-        <w:rPr>
-          <w:rFonts w:ascii="Aptos" w:hAnsi="Aptos" w:eastAsia="Microsoft YaHei"/>
-          <w:b/>
-          <w:color w:val="000000"/>
-          <w:sz w:val="30"/>
-        </w:rPr>
-        <w:t>5 核心页面</w:t>
+        <w:t>5 页面与导航</w:t>
+      </w:r>
+    </w:p>
+    <w:tbl>
+      <w:tblPr>
+        <w:tblW w:type="dxa" w:w="9576"/>
+        <w:jc w:val="center"/>
+        <w:tblLayout w:type="fixed"/>
+        <w:tblLook w:firstColumn="1" w:firstRow="1" w:lastColumn="0" w:lastRow="0" w:noHBand="0" w:noVBand="1" w:val="04A0"/>
+        <w:tblBorders>
+          <w:top w:val="single" w:sz="6" w:space="0" w:color="D9D9D9"/>
+          <w:left w:val="single" w:sz="6" w:space="0" w:color="D9D9D9"/>
+          <w:bottom w:val="single" w:sz="6" w:space="0" w:color="D9D9D9"/>
+          <w:right w:val="single" w:sz="6" w:space="0" w:color="D9D9D9"/>
+          <w:insideH w:val="single" w:sz="6" w:space="0" w:color="D9D9D9"/>
+          <w:insideV w:val="single" w:sz="6" w:space="0" w:color="D9D9D9"/>
+        </w:tblBorders>
+      </w:tblPr>
+      <w:tblGrid>
+        <w:gridCol w:w="1944"/>
+        <w:gridCol w:w="5976"/>
+        <w:gridCol w:w="1656"/>
+      </w:tblGrid>
+      <w:tr>
+        <w:trPr>
+          <w:tblHeader w:val="true"/>
+          <w:cantSplit/>
+        </w:trPr>
+        <w:tc>
+          <w:tcPr>
+            <w:tcW w:type="dxa" w:w="1944"/>
+            <w:shd w:fill="1F4E78"/>
+            <w:tcMar>
+              <w:top w:w="110" w:type="dxa"/>
+              <w:start w:w="130" w:type="dxa"/>
+              <w:bottom w:w="110" w:type="dxa"/>
+              <w:end w:w="130" w:type="dxa"/>
+            </w:tcMar>
+            <w:vAlign w:val="center"/>
+          </w:tcPr>
+          <w:p>
+            <w:pPr>
+              <w:spacing w:after="0"/>
+              <w:jc w:val="center"/>
+            </w:pPr>
+            <w:r>
+              <w:rPr>
+                <w:rFonts w:ascii="Microsoft YaHei" w:hAnsi="Microsoft YaHei" w:eastAsia="Microsoft YaHei"/>
+                <w:b/>
+                <w:color w:val="FFFFFF"/>
+                <w:sz w:val="19"/>
+              </w:rPr>
+              <w:t>路径</w:t>
+            </w:r>
+          </w:p>
+        </w:tc>
+        <w:tc>
+          <w:tcPr>
+            <w:tcW w:type="dxa" w:w="5976"/>
+            <w:shd w:fill="1F4E78"/>
+            <w:tcMar>
+              <w:top w:w="110" w:type="dxa"/>
+              <w:start w:w="130" w:type="dxa"/>
+              <w:bottom w:w="110" w:type="dxa"/>
+              <w:end w:w="130" w:type="dxa"/>
+            </w:tcMar>
+            <w:vAlign w:val="center"/>
+          </w:tcPr>
+          <w:p>
+            <w:pPr>
+              <w:spacing w:after="0"/>
+              <w:jc w:val="center"/>
+            </w:pPr>
+            <w:r>
+              <w:rPr>
+                <w:rFonts w:ascii="Microsoft YaHei" w:hAnsi="Microsoft YaHei" w:eastAsia="Microsoft YaHei"/>
+                <w:b/>
+                <w:color w:val="FFFFFF"/>
+                <w:sz w:val="19"/>
+              </w:rPr>
+              <w:t>用途</w:t>
+            </w:r>
+          </w:p>
+        </w:tc>
+        <w:tc>
+          <w:tcPr>
+            <w:tcW w:type="dxa" w:w="1656"/>
+            <w:shd w:fill="1F4E78"/>
+            <w:tcMar>
+              <w:top w:w="110" w:type="dxa"/>
+              <w:start w:w="130" w:type="dxa"/>
+              <w:bottom w:w="110" w:type="dxa"/>
+              <w:end w:w="130" w:type="dxa"/>
+            </w:tcMar>
+            <w:vAlign w:val="center"/>
+          </w:tcPr>
+          <w:p>
+            <w:pPr>
+              <w:spacing w:after="0"/>
+              <w:jc w:val="center"/>
+            </w:pPr>
+            <w:r>
+              <w:rPr>
+                <w:rFonts w:ascii="Microsoft YaHei" w:hAnsi="Microsoft YaHei" w:eastAsia="Microsoft YaHei"/>
+                <w:b/>
+                <w:color w:val="FFFFFF"/>
+                <w:sz w:val="19"/>
+              </w:rPr>
+              <w:t>访问规则</w:t>
+            </w:r>
+          </w:p>
+        </w:tc>
+      </w:tr>
+      <w:tr>
+        <w:trPr>
+          <w:cantSplit/>
+        </w:trPr>
+        <w:tc>
+          <w:tcPr>
+            <w:tcW w:type="dxa" w:w="1944"/>
+            <w:tcMar>
+              <w:top w:w="110" w:type="dxa"/>
+              <w:start w:w="130" w:type="dxa"/>
+              <w:bottom w:w="110" w:type="dxa"/>
+              <w:end w:w="130" w:type="dxa"/>
+            </w:tcMar>
+            <w:vAlign w:val="center"/>
+          </w:tcPr>
+          <w:p>
+            <w:pPr>
+              <w:spacing w:after="0" w:line="276" w:lineRule="auto"/>
+              <w:jc w:val="center"/>
+            </w:pPr>
+            <w:r>
+              <w:rPr>
+                <w:rFonts w:ascii="Microsoft YaHei" w:hAnsi="Microsoft YaHei" w:eastAsia="Microsoft YaHei"/>
+                <w:color w:val="000000"/>
+                <w:sz w:val="18"/>
+              </w:rPr>
+              <w:t>/</w:t>
+            </w:r>
+          </w:p>
+        </w:tc>
+        <w:tc>
+          <w:tcPr>
+            <w:tcW w:type="dxa" w:w="5976"/>
+            <w:tcMar>
+              <w:top w:w="110" w:type="dxa"/>
+              <w:start w:w="130" w:type="dxa"/>
+              <w:bottom w:w="110" w:type="dxa"/>
+              <w:end w:w="130" w:type="dxa"/>
+            </w:tcMar>
+            <w:vAlign w:val="center"/>
+          </w:tcPr>
+          <w:p>
+            <w:pPr>
+              <w:spacing w:after="0" w:line="276" w:lineRule="auto"/>
+              <w:jc w:val="left"/>
+            </w:pPr>
+            <w:r>
+              <w:rPr>
+                <w:rFonts w:ascii="Microsoft YaHei" w:hAnsi="Microsoft YaHei" w:eastAsia="Microsoft YaHei"/>
+                <w:color w:val="000000"/>
+                <w:sz w:val="18"/>
+              </w:rPr>
+              <w:t>未登录时展示产品介绍；登录后展示个人 Dashboard。</w:t>
+            </w:r>
+          </w:p>
+        </w:tc>
+        <w:tc>
+          <w:tcPr>
+            <w:tcW w:type="dxa" w:w="1656"/>
+            <w:tcMar>
+              <w:top w:w="110" w:type="dxa"/>
+              <w:start w:w="130" w:type="dxa"/>
+              <w:bottom w:w="110" w:type="dxa"/>
+              <w:end w:w="130" w:type="dxa"/>
+            </w:tcMar>
+            <w:vAlign w:val="center"/>
+          </w:tcPr>
+          <w:p>
+            <w:pPr>
+              <w:spacing w:after="0" w:line="276" w:lineRule="auto"/>
+              <w:jc w:val="center"/>
+            </w:pPr>
+            <w:r>
+              <w:rPr>
+                <w:rFonts w:ascii="Microsoft YaHei" w:hAnsi="Microsoft YaHei" w:eastAsia="Microsoft YaHei"/>
+                <w:color w:val="000000"/>
+                <w:sz w:val="18"/>
+              </w:rPr>
+              <w:t>公开或个人</w:t>
+            </w:r>
+          </w:p>
+        </w:tc>
+      </w:tr>
+      <w:tr>
+        <w:trPr>
+          <w:cantSplit/>
+        </w:trPr>
+        <w:tc>
+          <w:tcPr>
+            <w:tcW w:type="dxa" w:w="1944"/>
+            <w:shd w:fill="F3F7FA"/>
+            <w:tcMar>
+              <w:top w:w="110" w:type="dxa"/>
+              <w:start w:w="130" w:type="dxa"/>
+              <w:bottom w:w="110" w:type="dxa"/>
+              <w:end w:w="130" w:type="dxa"/>
+            </w:tcMar>
+            <w:vAlign w:val="center"/>
+          </w:tcPr>
+          <w:p>
+            <w:pPr>
+              <w:spacing w:after="0" w:line="276" w:lineRule="auto"/>
+              <w:jc w:val="center"/>
+            </w:pPr>
+            <w:r>
+              <w:rPr>
+                <w:rFonts w:ascii="Microsoft YaHei" w:hAnsi="Microsoft YaHei" w:eastAsia="Microsoft YaHei"/>
+                <w:color w:val="000000"/>
+                <w:sz w:val="18"/>
+              </w:rPr>
+              <w:t>/register</w:t>
+            </w:r>
+          </w:p>
+        </w:tc>
+        <w:tc>
+          <w:tcPr>
+            <w:tcW w:type="dxa" w:w="5976"/>
+            <w:shd w:fill="F3F7FA"/>
+            <w:tcMar>
+              <w:top w:w="110" w:type="dxa"/>
+              <w:start w:w="130" w:type="dxa"/>
+              <w:bottom w:w="110" w:type="dxa"/>
+              <w:end w:w="130" w:type="dxa"/>
+            </w:tcMar>
+            <w:vAlign w:val="center"/>
+          </w:tcPr>
+          <w:p>
+            <w:pPr>
+              <w:spacing w:after="0" w:line="276" w:lineRule="auto"/>
+              <w:jc w:val="left"/>
+            </w:pPr>
+            <w:r>
+              <w:rPr>
+                <w:rFonts w:ascii="Microsoft YaHei" w:hAnsi="Microsoft YaHei" w:eastAsia="Microsoft YaHei"/>
+                <w:color w:val="000000"/>
+                <w:sz w:val="18"/>
+              </w:rPr>
+              <w:t>创建用户名、邮箱和密码账号。</w:t>
+            </w:r>
+          </w:p>
+        </w:tc>
+        <w:tc>
+          <w:tcPr>
+            <w:tcW w:type="dxa" w:w="1656"/>
+            <w:shd w:fill="F3F7FA"/>
+            <w:tcMar>
+              <w:top w:w="110" w:type="dxa"/>
+              <w:start w:w="130" w:type="dxa"/>
+              <w:bottom w:w="110" w:type="dxa"/>
+              <w:end w:w="130" w:type="dxa"/>
+            </w:tcMar>
+            <w:vAlign w:val="center"/>
+          </w:tcPr>
+          <w:p>
+            <w:pPr>
+              <w:spacing w:after="0" w:line="276" w:lineRule="auto"/>
+              <w:jc w:val="center"/>
+            </w:pPr>
+            <w:r>
+              <w:rPr>
+                <w:rFonts w:ascii="Microsoft YaHei" w:hAnsi="Microsoft YaHei" w:eastAsia="Microsoft YaHei"/>
+                <w:color w:val="000000"/>
+                <w:sz w:val="18"/>
+              </w:rPr>
+              <w:t>未登录</w:t>
+            </w:r>
+          </w:p>
+        </w:tc>
+      </w:tr>
+      <w:tr>
+        <w:trPr>
+          <w:cantSplit/>
+        </w:trPr>
+        <w:tc>
+          <w:tcPr>
+            <w:tcW w:type="dxa" w:w="1944"/>
+            <w:tcMar>
+              <w:top w:w="110" w:type="dxa"/>
+              <w:start w:w="130" w:type="dxa"/>
+              <w:bottom w:w="110" w:type="dxa"/>
+              <w:end w:w="130" w:type="dxa"/>
+            </w:tcMar>
+            <w:vAlign w:val="center"/>
+          </w:tcPr>
+          <w:p>
+            <w:pPr>
+              <w:spacing w:after="0" w:line="276" w:lineRule="auto"/>
+              <w:jc w:val="center"/>
+            </w:pPr>
+            <w:r>
+              <w:rPr>
+                <w:rFonts w:ascii="Microsoft YaHei" w:hAnsi="Microsoft YaHei" w:eastAsia="Microsoft YaHei"/>
+                <w:color w:val="000000"/>
+                <w:sz w:val="18"/>
+              </w:rPr>
+              <w:t>/login</w:t>
+            </w:r>
+          </w:p>
+        </w:tc>
+        <w:tc>
+          <w:tcPr>
+            <w:tcW w:type="dxa" w:w="5976"/>
+            <w:tcMar>
+              <w:top w:w="110" w:type="dxa"/>
+              <w:start w:w="130" w:type="dxa"/>
+              <w:bottom w:w="110" w:type="dxa"/>
+              <w:end w:w="130" w:type="dxa"/>
+            </w:tcMar>
+            <w:vAlign w:val="center"/>
+          </w:tcPr>
+          <w:p>
+            <w:pPr>
+              <w:spacing w:after="0" w:line="276" w:lineRule="auto"/>
+              <w:jc w:val="left"/>
+            </w:pPr>
+            <w:r>
+              <w:rPr>
+                <w:rFonts w:ascii="Microsoft YaHei" w:hAnsi="Microsoft YaHei" w:eastAsia="Microsoft YaHei"/>
+                <w:color w:val="000000"/>
+                <w:sz w:val="18"/>
+              </w:rPr>
+              <w:t>使用邮箱和密码登录。</w:t>
+            </w:r>
+          </w:p>
+        </w:tc>
+        <w:tc>
+          <w:tcPr>
+            <w:tcW w:type="dxa" w:w="1656"/>
+            <w:tcMar>
+              <w:top w:w="110" w:type="dxa"/>
+              <w:start w:w="130" w:type="dxa"/>
+              <w:bottom w:w="110" w:type="dxa"/>
+              <w:end w:w="130" w:type="dxa"/>
+            </w:tcMar>
+            <w:vAlign w:val="center"/>
+          </w:tcPr>
+          <w:p>
+            <w:pPr>
+              <w:spacing w:after="0" w:line="276" w:lineRule="auto"/>
+              <w:jc w:val="center"/>
+            </w:pPr>
+            <w:r>
+              <w:rPr>
+                <w:rFonts w:ascii="Microsoft YaHei" w:hAnsi="Microsoft YaHei" w:eastAsia="Microsoft YaHei"/>
+                <w:color w:val="000000"/>
+                <w:sz w:val="18"/>
+              </w:rPr>
+              <w:t>未登录</w:t>
+            </w:r>
+          </w:p>
+        </w:tc>
+      </w:tr>
+      <w:tr>
+        <w:trPr>
+          <w:cantSplit/>
+        </w:trPr>
+        <w:tc>
+          <w:tcPr>
+            <w:tcW w:type="dxa" w:w="1944"/>
+            <w:shd w:fill="F3F7FA"/>
+            <w:tcMar>
+              <w:top w:w="110" w:type="dxa"/>
+              <w:start w:w="130" w:type="dxa"/>
+              <w:bottom w:w="110" w:type="dxa"/>
+              <w:end w:w="130" w:type="dxa"/>
+            </w:tcMar>
+            <w:vAlign w:val="center"/>
+          </w:tcPr>
+          <w:p>
+            <w:pPr>
+              <w:spacing w:after="0" w:line="276" w:lineRule="auto"/>
+              <w:jc w:val="center"/>
+            </w:pPr>
+            <w:r>
+              <w:rPr>
+                <w:rFonts w:ascii="Microsoft YaHei" w:hAnsi="Microsoft YaHei" w:eastAsia="Microsoft YaHei"/>
+                <w:color w:val="000000"/>
+                <w:sz w:val="18"/>
+              </w:rPr>
+              <w:t>/diary</w:t>
+            </w:r>
+          </w:p>
+        </w:tc>
+        <w:tc>
+          <w:tcPr>
+            <w:tcW w:type="dxa" w:w="5976"/>
+            <w:shd w:fill="F3F7FA"/>
+            <w:tcMar>
+              <w:top w:w="110" w:type="dxa"/>
+              <w:start w:w="130" w:type="dxa"/>
+              <w:bottom w:w="110" w:type="dxa"/>
+              <w:end w:w="130" w:type="dxa"/>
+            </w:tcMar>
+            <w:vAlign w:val="center"/>
+          </w:tcPr>
+          <w:p>
+            <w:pPr>
+              <w:spacing w:after="0" w:line="276" w:lineRule="auto"/>
+              <w:jc w:val="left"/>
+            </w:pPr>
+            <w:r>
+              <w:rPr>
+                <w:rFonts w:ascii="Microsoft YaHei" w:hAnsi="Microsoft YaHei" w:eastAsia="Microsoft YaHei"/>
+                <w:color w:val="000000"/>
+                <w:sz w:val="18"/>
+              </w:rPr>
+              <w:t>创建或继续编辑用户时区下的今日日志。</w:t>
+            </w:r>
+          </w:p>
+        </w:tc>
+        <w:tc>
+          <w:tcPr>
+            <w:tcW w:type="dxa" w:w="1656"/>
+            <w:shd w:fill="F3F7FA"/>
+            <w:tcMar>
+              <w:top w:w="110" w:type="dxa"/>
+              <w:start w:w="130" w:type="dxa"/>
+              <w:bottom w:w="110" w:type="dxa"/>
+              <w:end w:w="130" w:type="dxa"/>
+            </w:tcMar>
+            <w:vAlign w:val="center"/>
+          </w:tcPr>
+          <w:p>
+            <w:pPr>
+              <w:spacing w:after="0" w:line="276" w:lineRule="auto"/>
+              <w:jc w:val="center"/>
+            </w:pPr>
+            <w:r>
+              <w:rPr>
+                <w:rFonts w:ascii="Microsoft YaHei" w:hAnsi="Microsoft YaHei" w:eastAsia="Microsoft YaHei"/>
+                <w:color w:val="000000"/>
+                <w:sz w:val="18"/>
+              </w:rPr>
+              <w:t>需登录</w:t>
+            </w:r>
+          </w:p>
+        </w:tc>
+      </w:tr>
+      <w:tr>
+        <w:trPr>
+          <w:cantSplit/>
+        </w:trPr>
+        <w:tc>
+          <w:tcPr>
+            <w:tcW w:type="dxa" w:w="1944"/>
+            <w:tcMar>
+              <w:top w:w="110" w:type="dxa"/>
+              <w:start w:w="130" w:type="dxa"/>
+              <w:bottom w:w="110" w:type="dxa"/>
+              <w:end w:w="130" w:type="dxa"/>
+            </w:tcMar>
+            <w:vAlign w:val="center"/>
+          </w:tcPr>
+          <w:p>
+            <w:pPr>
+              <w:spacing w:after="0" w:line="276" w:lineRule="auto"/>
+              <w:jc w:val="center"/>
+            </w:pPr>
+            <w:r>
+              <w:rPr>
+                <w:rFonts w:ascii="Microsoft YaHei" w:hAnsi="Microsoft YaHei" w:eastAsia="Microsoft YaHei"/>
+                <w:color w:val="000000"/>
+                <w:sz w:val="18"/>
+              </w:rPr>
+              <w:t>/history</w:t>
+            </w:r>
+          </w:p>
+        </w:tc>
+        <w:tc>
+          <w:tcPr>
+            <w:tcW w:type="dxa" w:w="5976"/>
+            <w:tcMar>
+              <w:top w:w="110" w:type="dxa"/>
+              <w:start w:w="130" w:type="dxa"/>
+              <w:bottom w:w="110" w:type="dxa"/>
+              <w:end w:w="130" w:type="dxa"/>
+            </w:tcMar>
+            <w:vAlign w:val="center"/>
+          </w:tcPr>
+          <w:p>
+            <w:pPr>
+              <w:spacing w:after="0" w:line="276" w:lineRule="auto"/>
+              <w:jc w:val="left"/>
+            </w:pPr>
+            <w:r>
+              <w:rPr>
+                <w:rFonts w:ascii="Microsoft YaHei" w:hAnsi="Microsoft YaHei" w:eastAsia="Microsoft YaHei"/>
+                <w:color w:val="000000"/>
+                <w:sz w:val="18"/>
+              </w:rPr>
+              <w:t>浏览当前用户的全部历史日志。</w:t>
+            </w:r>
+          </w:p>
+        </w:tc>
+        <w:tc>
+          <w:tcPr>
+            <w:tcW w:type="dxa" w:w="1656"/>
+            <w:tcMar>
+              <w:top w:w="110" w:type="dxa"/>
+              <w:start w:w="130" w:type="dxa"/>
+              <w:bottom w:w="110" w:type="dxa"/>
+              <w:end w:w="130" w:type="dxa"/>
+            </w:tcMar>
+            <w:vAlign w:val="center"/>
+          </w:tcPr>
+          <w:p>
+            <w:pPr>
+              <w:spacing w:after="0" w:line="276" w:lineRule="auto"/>
+              <w:jc w:val="center"/>
+            </w:pPr>
+            <w:r>
+              <w:rPr>
+                <w:rFonts w:ascii="Microsoft YaHei" w:hAnsi="Microsoft YaHei" w:eastAsia="Microsoft YaHei"/>
+                <w:color w:val="000000"/>
+                <w:sz w:val="18"/>
+              </w:rPr>
+              <w:t>需登录</w:t>
+            </w:r>
+          </w:p>
+        </w:tc>
+      </w:tr>
+      <w:tr>
+        <w:trPr>
+          <w:cantSplit/>
+        </w:trPr>
+        <w:tc>
+          <w:tcPr>
+            <w:tcW w:type="dxa" w:w="1944"/>
+            <w:shd w:fill="F3F7FA"/>
+            <w:tcMar>
+              <w:top w:w="110" w:type="dxa"/>
+              <w:start w:w="130" w:type="dxa"/>
+              <w:bottom w:w="110" w:type="dxa"/>
+              <w:end w:w="130" w:type="dxa"/>
+            </w:tcMar>
+            <w:vAlign w:val="center"/>
+          </w:tcPr>
+          <w:p>
+            <w:pPr>
+              <w:spacing w:after="0" w:line="276" w:lineRule="auto"/>
+              <w:jc w:val="center"/>
+            </w:pPr>
+            <w:r>
+              <w:rPr>
+                <w:rFonts w:ascii="Microsoft YaHei" w:hAnsi="Microsoft YaHei" w:eastAsia="Microsoft YaHei"/>
+                <w:color w:val="000000"/>
+                <w:sz w:val="18"/>
+              </w:rPr>
+              <w:t>/diary/[id]</w:t>
+            </w:r>
+          </w:p>
+        </w:tc>
+        <w:tc>
+          <w:tcPr>
+            <w:tcW w:type="dxa" w:w="5976"/>
+            <w:shd w:fill="F3F7FA"/>
+            <w:tcMar>
+              <w:top w:w="110" w:type="dxa"/>
+              <w:start w:w="130" w:type="dxa"/>
+              <w:bottom w:w="110" w:type="dxa"/>
+              <w:end w:w="130" w:type="dxa"/>
+            </w:tcMar>
+            <w:vAlign w:val="center"/>
+          </w:tcPr>
+          <w:p>
+            <w:pPr>
+              <w:spacing w:after="0" w:line="276" w:lineRule="auto"/>
+              <w:jc w:val="left"/>
+            </w:pPr>
+            <w:r>
+              <w:rPr>
+                <w:rFonts w:ascii="Microsoft YaHei" w:hAnsi="Microsoft YaHei" w:eastAsia="Microsoft YaHei"/>
+                <w:color w:val="000000"/>
+                <w:sz w:val="18"/>
+              </w:rPr>
+              <w:t>查看当前用户的单篇日志详情。</w:t>
+            </w:r>
+          </w:p>
+        </w:tc>
+        <w:tc>
+          <w:tcPr>
+            <w:tcW w:type="dxa" w:w="1656"/>
+            <w:shd w:fill="F3F7FA"/>
+            <w:tcMar>
+              <w:top w:w="110" w:type="dxa"/>
+              <w:start w:w="130" w:type="dxa"/>
+              <w:bottom w:w="110" w:type="dxa"/>
+              <w:end w:w="130" w:type="dxa"/>
+            </w:tcMar>
+            <w:vAlign w:val="center"/>
+          </w:tcPr>
+          <w:p>
+            <w:pPr>
+              <w:spacing w:after="0" w:line="276" w:lineRule="auto"/>
+              <w:jc w:val="center"/>
+            </w:pPr>
+            <w:r>
+              <w:rPr>
+                <w:rFonts w:ascii="Microsoft YaHei" w:hAnsi="Microsoft YaHei" w:eastAsia="Microsoft YaHei"/>
+                <w:color w:val="000000"/>
+                <w:sz w:val="18"/>
+              </w:rPr>
+              <w:t>需登录</w:t>
+            </w:r>
+          </w:p>
+        </w:tc>
+      </w:tr>
+      <w:tr>
+        <w:trPr>
+          <w:cantSplit/>
+        </w:trPr>
+        <w:tc>
+          <w:tcPr>
+            <w:tcW w:type="dxa" w:w="1944"/>
+            <w:tcMar>
+              <w:top w:w="110" w:type="dxa"/>
+              <w:start w:w="130" w:type="dxa"/>
+              <w:bottom w:w="110" w:type="dxa"/>
+              <w:end w:w="130" w:type="dxa"/>
+            </w:tcMar>
+            <w:vAlign w:val="center"/>
+          </w:tcPr>
+          <w:p>
+            <w:pPr>
+              <w:spacing w:after="0" w:line="276" w:lineRule="auto"/>
+              <w:jc w:val="center"/>
+            </w:pPr>
+            <w:r>
+              <w:rPr>
+                <w:rFonts w:ascii="Microsoft YaHei" w:hAnsi="Microsoft YaHei" w:eastAsia="Microsoft YaHei"/>
+                <w:color w:val="000000"/>
+                <w:sz w:val="18"/>
+              </w:rPr>
+              <w:t>/search</w:t>
+            </w:r>
+          </w:p>
+        </w:tc>
+        <w:tc>
+          <w:tcPr>
+            <w:tcW w:type="dxa" w:w="5976"/>
+            <w:tcMar>
+              <w:top w:w="110" w:type="dxa"/>
+              <w:start w:w="130" w:type="dxa"/>
+              <w:bottom w:w="110" w:type="dxa"/>
+              <w:end w:w="130" w:type="dxa"/>
+            </w:tcMar>
+            <w:vAlign w:val="center"/>
+          </w:tcPr>
+          <w:p>
+            <w:pPr>
+              <w:spacing w:after="0" w:line="276" w:lineRule="auto"/>
+              <w:jc w:val="left"/>
+            </w:pPr>
+            <w:r>
+              <w:rPr>
+                <w:rFonts w:ascii="Microsoft YaHei" w:hAnsi="Microsoft YaHei" w:eastAsia="Microsoft YaHei"/>
+                <w:color w:val="000000"/>
+                <w:sz w:val="18"/>
+              </w:rPr>
+              <w:t>搜索当前用户自己的日志。</w:t>
+            </w:r>
+          </w:p>
+        </w:tc>
+        <w:tc>
+          <w:tcPr>
+            <w:tcW w:type="dxa" w:w="1656"/>
+            <w:tcMar>
+              <w:top w:w="110" w:type="dxa"/>
+              <w:start w:w="130" w:type="dxa"/>
+              <w:bottom w:w="110" w:type="dxa"/>
+              <w:end w:w="130" w:type="dxa"/>
+            </w:tcMar>
+            <w:vAlign w:val="center"/>
+          </w:tcPr>
+          <w:p>
+            <w:pPr>
+              <w:spacing w:after="0" w:line="276" w:lineRule="auto"/>
+              <w:jc w:val="center"/>
+            </w:pPr>
+            <w:r>
+              <w:rPr>
+                <w:rFonts w:ascii="Microsoft YaHei" w:hAnsi="Microsoft YaHei" w:eastAsia="Microsoft YaHei"/>
+                <w:color w:val="000000"/>
+                <w:sz w:val="18"/>
+              </w:rPr>
+              <w:t>需登录</w:t>
+            </w:r>
+          </w:p>
+        </w:tc>
+      </w:tr>
+      <w:tr>
+        <w:trPr>
+          <w:cantSplit/>
+        </w:trPr>
+        <w:tc>
+          <w:tcPr>
+            <w:tcW w:type="dxa" w:w="1944"/>
+            <w:shd w:fill="F3F7FA"/>
+            <w:tcMar>
+              <w:top w:w="110" w:type="dxa"/>
+              <w:start w:w="130" w:type="dxa"/>
+              <w:bottom w:w="110" w:type="dxa"/>
+              <w:end w:w="130" w:type="dxa"/>
+            </w:tcMar>
+            <w:vAlign w:val="center"/>
+          </w:tcPr>
+          <w:p>
+            <w:pPr>
+              <w:spacing w:after="0" w:line="276" w:lineRule="auto"/>
+              <w:jc w:val="center"/>
+            </w:pPr>
+            <w:r>
+              <w:rPr>
+                <w:rFonts w:ascii="Microsoft YaHei" w:hAnsi="Microsoft YaHei" w:eastAsia="Microsoft YaHei"/>
+                <w:color w:val="000000"/>
+                <w:sz w:val="18"/>
+              </w:rPr>
+              <w:t>/settings</w:t>
+            </w:r>
+          </w:p>
+        </w:tc>
+        <w:tc>
+          <w:tcPr>
+            <w:tcW w:type="dxa" w:w="5976"/>
+            <w:shd w:fill="F3F7FA"/>
+            <w:tcMar>
+              <w:top w:w="110" w:type="dxa"/>
+              <w:start w:w="130" w:type="dxa"/>
+              <w:bottom w:w="110" w:type="dxa"/>
+              <w:end w:w="130" w:type="dxa"/>
+            </w:tcMar>
+            <w:vAlign w:val="center"/>
+          </w:tcPr>
+          <w:p>
+            <w:pPr>
+              <w:spacing w:after="0" w:line="276" w:lineRule="auto"/>
+              <w:jc w:val="left"/>
+            </w:pPr>
+            <w:r>
+              <w:rPr>
+                <w:rFonts w:ascii="Microsoft YaHei" w:hAnsi="Microsoft YaHei" w:eastAsia="Microsoft YaHei"/>
+                <w:color w:val="000000"/>
+                <w:sz w:val="18"/>
+              </w:rPr>
+              <w:t>查看资料并修改用户名和时区。</w:t>
+            </w:r>
+          </w:p>
+        </w:tc>
+        <w:tc>
+          <w:tcPr>
+            <w:tcW w:type="dxa" w:w="1656"/>
+            <w:shd w:fill="F3F7FA"/>
+            <w:tcMar>
+              <w:top w:w="110" w:type="dxa"/>
+              <w:start w:w="130" w:type="dxa"/>
+              <w:bottom w:w="110" w:type="dxa"/>
+              <w:end w:w="130" w:type="dxa"/>
+            </w:tcMar>
+            <w:vAlign w:val="center"/>
+          </w:tcPr>
+          <w:p>
+            <w:pPr>
+              <w:spacing w:after="0" w:line="276" w:lineRule="auto"/>
+              <w:jc w:val="center"/>
+            </w:pPr>
+            <w:r>
+              <w:rPr>
+                <w:rFonts w:ascii="Microsoft YaHei" w:hAnsi="Microsoft YaHei" w:eastAsia="Microsoft YaHei"/>
+                <w:color w:val="000000"/>
+                <w:sz w:val="18"/>
+              </w:rPr>
+              <w:t>需登录</w:t>
+            </w:r>
+          </w:p>
+        </w:tc>
+      </w:tr>
+    </w:tbl>
+    <w:p>
+      <w:pPr>
+        <w:spacing w:after="40"/>
+      </w:pPr>
+    </w:p>
+    <w:p>
+      <w:pPr>
+        <w:pStyle w:val="Heading1"/>
+        <w:keepNext/>
+      </w:pPr>
+      <w:r>
+        <w:t>6 数据与权限规则</w:t>
       </w:r>
     </w:p>
     <w:p>
       <w:pPr>
         <w:pStyle w:val="ListBullet"/>
-        <w:spacing w:after="80" w:line="300" w:lineRule="auto"/>
+        <w:keepLines/>
       </w:pPr>
       <w:r>
         <w:rPr>
-          <w:rFonts w:ascii="Aptos" w:hAnsi="Aptos" w:eastAsia="Microsoft YaHei"/>
-          <w:color w:val="000000"/>
+          <w:rFonts w:ascii="Microsoft YaHei" w:hAnsi="Microsoft YaHei" w:eastAsia="Microsoft YaHei"/>
           <w:sz w:val="21"/>
         </w:rPr>
-        <w:t>首页或今日日志：创建或继续编辑当天日志。</w:t>
+        <w:t>User 与 Diary 是一对多关系，每篇 Diary 必须属于一个用户。</w:t>
       </w:r>
     </w:p>
     <w:p>
       <w:pPr>
         <w:pStyle w:val="ListBullet"/>
-        <w:spacing w:after="80" w:line="300" w:lineRule="auto"/>
+        <w:keepLines/>
       </w:pPr>
       <w:r>
         <w:rPr>
-          <w:rFonts w:ascii="Aptos" w:hAnsi="Aptos" w:eastAsia="Microsoft YaHei"/>
-          <w:color w:val="000000"/>
+          <w:rFonts w:ascii="Microsoft YaHei" w:hAnsi="Microsoft YaHei" w:eastAsia="Microsoft YaHei"/>
           <w:sz w:val="21"/>
         </w:rPr>
-        <w:t>历史日志页：按时间浏览全部历史记录。</w:t>
+        <w:t>Diary 使用 userId 和 date 复合唯一约束，因此不同用户可以在同一天分别记录，同一用户同一天只有一篇。</w:t>
       </w:r>
     </w:p>
     <w:p>
       <w:pPr>
         <w:pStyle w:val="ListBullet"/>
-        <w:spacing w:after="80" w:line="300" w:lineRule="auto"/>
+        <w:keepLines/>
       </w:pPr>
       <w:r>
         <w:rPr>
-          <w:rFonts w:ascii="Aptos" w:hAnsi="Aptos" w:eastAsia="Microsoft YaHei"/>
-          <w:color w:val="000000"/>
+          <w:rFonts w:ascii="Microsoft YaHei" w:hAnsi="Microsoft YaHei" w:eastAsia="Microsoft YaHei"/>
           <w:sz w:val="21"/>
         </w:rPr>
-        <w:t>日志详情页：查看和修改单篇日志。</w:t>
+        <w:t>用户身份只从 Better Auth Session 获取，客户端不能通过提交 userId 指定或修改数据归属。</w:t>
       </w:r>
     </w:p>
     <w:p>
       <w:pPr>
         <w:pStyle w:val="ListBullet"/>
-        <w:spacing w:after="80" w:line="300" w:lineRule="auto"/>
+        <w:keepLines/>
       </w:pPr>
       <w:r>
         <w:rPr>
-          <w:rFonts w:ascii="Aptos" w:hAnsi="Aptos" w:eastAsia="Microsoft YaHei"/>
-          <w:color w:val="000000"/>
+          <w:rFonts w:ascii="Microsoft YaHei" w:hAnsi="Microsoft YaHei" w:eastAsia="Microsoft YaHei"/>
           <w:sz w:val="21"/>
         </w:rPr>
-        <w:t>搜索页：输入关键词并查看匹配结果。</w:t>
+        <w:t>今日记录、历史、搜索、详情和 Dashboard 查询都限定当前用户。访问其他用户的 Diary ID 返回 404。</w:t>
+      </w:r>
+    </w:p>
+    <w:p>
+      <w:pPr>
+        <w:pStyle w:val="ListBullet"/>
+        <w:keepLines/>
+      </w:pPr>
+      <w:r>
+        <w:rPr>
+          <w:rFonts w:ascii="Microsoft YaHei" w:hAnsi="Microsoft YaHei" w:eastAsia="Microsoft YaHei"/>
+          <w:sz w:val="21"/>
+        </w:rPr>
+        <w:t>User.timeZone 默认是 Asia/Shanghai。服务端校验 IANA 时区，并按用户时区计算今天的日期键。</w:t>
+      </w:r>
+    </w:p>
+    <w:p>
+      <w:pPr>
+        <w:pStyle w:val="ListBullet"/>
+        <w:keepLines/>
+      </w:pPr>
+      <w:r>
+        <w:rPr>
+          <w:rFonts w:ascii="Microsoft YaHei" w:hAnsi="Microsoft YaHei" w:eastAsia="Microsoft YaHei"/>
+          <w:sz w:val="21"/>
+        </w:rPr>
+        <w:t>邮箱当前只读。设置接口只允许当前用户修改自己的用户名和时区。</w:t>
       </w:r>
     </w:p>
     <w:p>
       <w:pPr>
         <w:pStyle w:val="Heading1"/>
-        <w:spacing w:before="280" w:after="120"/>
+        <w:keepNext/>
       </w:pPr>
       <w:r>
-        <w:rPr>
-          <w:rFonts w:ascii="Aptos" w:hAnsi="Aptos" w:eastAsia="Microsoft YaHei"/>
-          <w:b/>
-          <w:color w:val="000000"/>
-          <w:sz w:val="30"/>
-        </w:rPr>
-        <w:t>6 非 MVP 范围</w:t>
+        <w:t>7 技术架构与交付状态</w:t>
       </w:r>
     </w:p>
+    <w:tbl>
+      <w:tblPr>
+        <w:tblW w:type="dxa" w:w="9576"/>
+        <w:jc w:val="center"/>
+        <w:tblLayout w:type="fixed"/>
+        <w:tblLook w:firstColumn="1" w:firstRow="1" w:lastColumn="0" w:lastRow="0" w:noHBand="0" w:noVBand="1" w:val="04A0"/>
+        <w:tblBorders>
+          <w:top w:val="single" w:sz="6" w:space="0" w:color="D9D9D9"/>
+          <w:left w:val="single" w:sz="6" w:space="0" w:color="D9D9D9"/>
+          <w:bottom w:val="single" w:sz="6" w:space="0" w:color="D9D9D9"/>
+          <w:right w:val="single" w:sz="6" w:space="0" w:color="D9D9D9"/>
+          <w:insideH w:val="single" w:sz="6" w:space="0" w:color="D9D9D9"/>
+          <w:insideV w:val="single" w:sz="6" w:space="0" w:color="D9D9D9"/>
+        </w:tblBorders>
+      </w:tblPr>
+      <w:tblGrid>
+        <w:gridCol w:w="1944"/>
+        <w:gridCol w:w="7632"/>
+      </w:tblGrid>
+      <w:tr>
+        <w:trPr>
+          <w:tblHeader w:val="true"/>
+          <w:cantSplit/>
+        </w:trPr>
+        <w:tc>
+          <w:tcPr>
+            <w:tcW w:type="dxa" w:w="1944"/>
+            <w:shd w:fill="1F4E78"/>
+            <w:tcMar>
+              <w:top w:w="110" w:type="dxa"/>
+              <w:start w:w="130" w:type="dxa"/>
+              <w:bottom w:w="110" w:type="dxa"/>
+              <w:end w:w="130" w:type="dxa"/>
+            </w:tcMar>
+            <w:vAlign w:val="center"/>
+          </w:tcPr>
+          <w:p>
+            <w:pPr>
+              <w:spacing w:after="0"/>
+              <w:jc w:val="center"/>
+            </w:pPr>
+            <w:r>
+              <w:rPr>
+                <w:rFonts w:ascii="Microsoft YaHei" w:hAnsi="Microsoft YaHei" w:eastAsia="Microsoft YaHei"/>
+                <w:b/>
+                <w:color w:val="FFFFFF"/>
+                <w:sz w:val="19"/>
+              </w:rPr>
+              <w:t>层级</w:t>
+            </w:r>
+          </w:p>
+        </w:tc>
+        <w:tc>
+          <w:tcPr>
+            <w:tcW w:type="dxa" w:w="7632"/>
+            <w:shd w:fill="1F4E78"/>
+            <w:tcMar>
+              <w:top w:w="110" w:type="dxa"/>
+              <w:start w:w="130" w:type="dxa"/>
+              <w:bottom w:w="110" w:type="dxa"/>
+              <w:end w:w="130" w:type="dxa"/>
+            </w:tcMar>
+            <w:vAlign w:val="center"/>
+          </w:tcPr>
+          <w:p>
+            <w:pPr>
+              <w:spacing w:after="0"/>
+              <w:jc w:val="center"/>
+            </w:pPr>
+            <w:r>
+              <w:rPr>
+                <w:rFonts w:ascii="Microsoft YaHei" w:hAnsi="Microsoft YaHei" w:eastAsia="Microsoft YaHei"/>
+                <w:b/>
+                <w:color w:val="FFFFFF"/>
+                <w:sz w:val="19"/>
+              </w:rPr>
+              <w:t>当前方案</w:t>
+            </w:r>
+          </w:p>
+        </w:tc>
+      </w:tr>
+      <w:tr>
+        <w:trPr>
+          <w:cantSplit/>
+        </w:trPr>
+        <w:tc>
+          <w:tcPr>
+            <w:tcW w:type="dxa" w:w="1944"/>
+            <w:tcMar>
+              <w:top w:w="110" w:type="dxa"/>
+              <w:start w:w="130" w:type="dxa"/>
+              <w:bottom w:w="110" w:type="dxa"/>
+              <w:end w:w="130" w:type="dxa"/>
+            </w:tcMar>
+            <w:vAlign w:val="center"/>
+          </w:tcPr>
+          <w:p>
+            <w:pPr>
+              <w:spacing w:after="0" w:line="276" w:lineRule="auto"/>
+              <w:jc w:val="center"/>
+            </w:pPr>
+            <w:r>
+              <w:rPr>
+                <w:rFonts w:ascii="Microsoft YaHei" w:hAnsi="Microsoft YaHei" w:eastAsia="Microsoft YaHei"/>
+                <w:color w:val="000000"/>
+                <w:sz w:val="18"/>
+              </w:rPr>
+              <w:t>Web</w:t>
+            </w:r>
+          </w:p>
+        </w:tc>
+        <w:tc>
+          <w:tcPr>
+            <w:tcW w:type="dxa" w:w="7632"/>
+            <w:tcMar>
+              <w:top w:w="110" w:type="dxa"/>
+              <w:start w:w="130" w:type="dxa"/>
+              <w:bottom w:w="110" w:type="dxa"/>
+              <w:end w:w="130" w:type="dxa"/>
+            </w:tcMar>
+            <w:vAlign w:val="center"/>
+          </w:tcPr>
+          <w:p>
+            <w:pPr>
+              <w:spacing w:after="0" w:line="276" w:lineRule="auto"/>
+              <w:jc w:val="left"/>
+            </w:pPr>
+            <w:r>
+              <w:rPr>
+                <w:rFonts w:ascii="Microsoft YaHei" w:hAnsi="Microsoft YaHei" w:eastAsia="Microsoft YaHei"/>
+                <w:color w:val="000000"/>
+                <w:sz w:val="18"/>
+              </w:rPr>
+              <w:t>Next.js 16 App Router、React 19、TypeScript、Tailwind CSS 4</w:t>
+            </w:r>
+          </w:p>
+        </w:tc>
+      </w:tr>
+      <w:tr>
+        <w:trPr>
+          <w:cantSplit/>
+        </w:trPr>
+        <w:tc>
+          <w:tcPr>
+            <w:tcW w:type="dxa" w:w="1944"/>
+            <w:shd w:fill="F3F7FA"/>
+            <w:tcMar>
+              <w:top w:w="110" w:type="dxa"/>
+              <w:start w:w="130" w:type="dxa"/>
+              <w:bottom w:w="110" w:type="dxa"/>
+              <w:end w:w="130" w:type="dxa"/>
+            </w:tcMar>
+            <w:vAlign w:val="center"/>
+          </w:tcPr>
+          <w:p>
+            <w:pPr>
+              <w:spacing w:after="0" w:line="276" w:lineRule="auto"/>
+              <w:jc w:val="center"/>
+            </w:pPr>
+            <w:r>
+              <w:rPr>
+                <w:rFonts w:ascii="Microsoft YaHei" w:hAnsi="Microsoft YaHei" w:eastAsia="Microsoft YaHei"/>
+                <w:color w:val="000000"/>
+                <w:sz w:val="18"/>
+              </w:rPr>
+              <w:t>认证</w:t>
+            </w:r>
+          </w:p>
+        </w:tc>
+        <w:tc>
+          <w:tcPr>
+            <w:tcW w:type="dxa" w:w="7632"/>
+            <w:shd w:fill="F3F7FA"/>
+            <w:tcMar>
+              <w:top w:w="110" w:type="dxa"/>
+              <w:start w:w="130" w:type="dxa"/>
+              <w:bottom w:w="110" w:type="dxa"/>
+              <w:end w:w="130" w:type="dxa"/>
+            </w:tcMar>
+            <w:vAlign w:val="center"/>
+          </w:tcPr>
+          <w:p>
+            <w:pPr>
+              <w:spacing w:after="0" w:line="276" w:lineRule="auto"/>
+              <w:jc w:val="left"/>
+            </w:pPr>
+            <w:r>
+              <w:rPr>
+                <w:rFonts w:ascii="Microsoft YaHei" w:hAnsi="Microsoft YaHei" w:eastAsia="Microsoft YaHei"/>
+                <w:color w:val="000000"/>
+                <w:sz w:val="18"/>
+              </w:rPr>
+              <w:t>Better Auth 与 Prisma Adapter，邮箱密码认证和数据库 Session</w:t>
+            </w:r>
+          </w:p>
+        </w:tc>
+      </w:tr>
+      <w:tr>
+        <w:trPr>
+          <w:cantSplit/>
+        </w:trPr>
+        <w:tc>
+          <w:tcPr>
+            <w:tcW w:type="dxa" w:w="1944"/>
+            <w:tcMar>
+              <w:top w:w="110" w:type="dxa"/>
+              <w:start w:w="130" w:type="dxa"/>
+              <w:bottom w:w="110" w:type="dxa"/>
+              <w:end w:w="130" w:type="dxa"/>
+            </w:tcMar>
+            <w:vAlign w:val="center"/>
+          </w:tcPr>
+          <w:p>
+            <w:pPr>
+              <w:spacing w:after="0" w:line="276" w:lineRule="auto"/>
+              <w:jc w:val="center"/>
+            </w:pPr>
+            <w:r>
+              <w:rPr>
+                <w:rFonts w:ascii="Microsoft YaHei" w:hAnsi="Microsoft YaHei" w:eastAsia="Microsoft YaHei"/>
+                <w:color w:val="000000"/>
+                <w:sz w:val="18"/>
+              </w:rPr>
+              <w:t>数据</w:t>
+            </w:r>
+          </w:p>
+        </w:tc>
+        <w:tc>
+          <w:tcPr>
+            <w:tcW w:type="dxa" w:w="7632"/>
+            <w:tcMar>
+              <w:top w:w="110" w:type="dxa"/>
+              <w:start w:w="130" w:type="dxa"/>
+              <w:bottom w:w="110" w:type="dxa"/>
+              <w:end w:w="130" w:type="dxa"/>
+            </w:tcMar>
+            <w:vAlign w:val="center"/>
+          </w:tcPr>
+          <w:p>
+            <w:pPr>
+              <w:spacing w:after="0" w:line="276" w:lineRule="auto"/>
+              <w:jc w:val="left"/>
+            </w:pPr>
+            <w:r>
+              <w:rPr>
+                <w:rFonts w:ascii="Microsoft YaHei" w:hAnsi="Microsoft YaHei" w:eastAsia="Microsoft YaHei"/>
+                <w:color w:val="000000"/>
+                <w:sz w:val="18"/>
+              </w:rPr>
+              <w:t>Prisma 6 与 PostgreSQL；SQLite migration 已归档</w:t>
+            </w:r>
+          </w:p>
+        </w:tc>
+      </w:tr>
+      <w:tr>
+        <w:trPr>
+          <w:cantSplit/>
+        </w:trPr>
+        <w:tc>
+          <w:tcPr>
+            <w:tcW w:type="dxa" w:w="1944"/>
+            <w:shd w:fill="F3F7FA"/>
+            <w:tcMar>
+              <w:top w:w="110" w:type="dxa"/>
+              <w:start w:w="130" w:type="dxa"/>
+              <w:bottom w:w="110" w:type="dxa"/>
+              <w:end w:w="130" w:type="dxa"/>
+            </w:tcMar>
+            <w:vAlign w:val="center"/>
+          </w:tcPr>
+          <w:p>
+            <w:pPr>
+              <w:spacing w:after="0" w:line="276" w:lineRule="auto"/>
+              <w:jc w:val="center"/>
+            </w:pPr>
+            <w:r>
+              <w:rPr>
+                <w:rFonts w:ascii="Microsoft YaHei" w:hAnsi="Microsoft YaHei" w:eastAsia="Microsoft YaHei"/>
+                <w:color w:val="000000"/>
+                <w:sz w:val="18"/>
+              </w:rPr>
+              <w:t>本地开发</w:t>
+            </w:r>
+          </w:p>
+        </w:tc>
+        <w:tc>
+          <w:tcPr>
+            <w:tcW w:type="dxa" w:w="7632"/>
+            <w:shd w:fill="F3F7FA"/>
+            <w:tcMar>
+              <w:top w:w="110" w:type="dxa"/>
+              <w:start w:w="130" w:type="dxa"/>
+              <w:bottom w:w="110" w:type="dxa"/>
+              <w:end w:w="130" w:type="dxa"/>
+            </w:tcMar>
+            <w:vAlign w:val="center"/>
+          </w:tcPr>
+          <w:p>
+            <w:pPr>
+              <w:spacing w:after="0" w:line="276" w:lineRule="auto"/>
+              <w:jc w:val="left"/>
+            </w:pPr>
+            <w:r>
+              <w:rPr>
+                <w:rFonts w:ascii="Microsoft YaHei" w:hAnsi="Microsoft YaHei" w:eastAsia="Microsoft YaHei"/>
+                <w:color w:val="000000"/>
+                <w:sz w:val="18"/>
+              </w:rPr>
+              <w:t>Docker Compose 运行 postgres:17-alpine，映射 localhost:5433</w:t>
+            </w:r>
+          </w:p>
+        </w:tc>
+      </w:tr>
+      <w:tr>
+        <w:trPr>
+          <w:cantSplit/>
+        </w:trPr>
+        <w:tc>
+          <w:tcPr>
+            <w:tcW w:type="dxa" w:w="1944"/>
+            <w:tcMar>
+              <w:top w:w="110" w:type="dxa"/>
+              <w:start w:w="130" w:type="dxa"/>
+              <w:bottom w:w="110" w:type="dxa"/>
+              <w:end w:w="130" w:type="dxa"/>
+            </w:tcMar>
+            <w:vAlign w:val="center"/>
+          </w:tcPr>
+          <w:p>
+            <w:pPr>
+              <w:spacing w:after="0" w:line="276" w:lineRule="auto"/>
+              <w:jc w:val="center"/>
+            </w:pPr>
+            <w:r>
+              <w:rPr>
+                <w:rFonts w:ascii="Microsoft YaHei" w:hAnsi="Microsoft YaHei" w:eastAsia="Microsoft YaHei"/>
+                <w:color w:val="000000"/>
+                <w:sz w:val="18"/>
+              </w:rPr>
+              <w:t>测试</w:t>
+            </w:r>
+          </w:p>
+        </w:tc>
+        <w:tc>
+          <w:tcPr>
+            <w:tcW w:type="dxa" w:w="7632"/>
+            <w:tcMar>
+              <w:top w:w="110" w:type="dxa"/>
+              <w:start w:w="130" w:type="dxa"/>
+              <w:bottom w:w="110" w:type="dxa"/>
+              <w:end w:w="130" w:type="dxa"/>
+            </w:tcMar>
+            <w:vAlign w:val="center"/>
+          </w:tcPr>
+          <w:p>
+            <w:pPr>
+              <w:spacing w:after="0" w:line="276" w:lineRule="auto"/>
+              <w:jc w:val="left"/>
+            </w:pPr>
+            <w:r>
+              <w:rPr>
+                <w:rFonts w:ascii="Microsoft YaHei" w:hAnsi="Microsoft YaHei" w:eastAsia="Microsoft YaHei"/>
+                <w:color w:val="000000"/>
+                <w:sz w:val="18"/>
+              </w:rPr>
+              <w:t>Node.js 内置测试运行器，覆盖认证、Session、用户隔离、时区、迁移和健康检查</w:t>
+            </w:r>
+          </w:p>
+        </w:tc>
+      </w:tr>
+      <w:tr>
+        <w:trPr>
+          <w:cantSplit/>
+        </w:trPr>
+        <w:tc>
+          <w:tcPr>
+            <w:tcW w:type="dxa" w:w="1944"/>
+            <w:shd w:fill="F3F7FA"/>
+            <w:tcMar>
+              <w:top w:w="110" w:type="dxa"/>
+              <w:start w:w="130" w:type="dxa"/>
+              <w:bottom w:w="110" w:type="dxa"/>
+              <w:end w:w="130" w:type="dxa"/>
+            </w:tcMar>
+            <w:vAlign w:val="center"/>
+          </w:tcPr>
+          <w:p>
+            <w:pPr>
+              <w:spacing w:after="0" w:line="276" w:lineRule="auto"/>
+              <w:jc w:val="center"/>
+            </w:pPr>
+            <w:r>
+              <w:rPr>
+                <w:rFonts w:ascii="Microsoft YaHei" w:hAnsi="Microsoft YaHei" w:eastAsia="Microsoft YaHei"/>
+                <w:color w:val="000000"/>
+                <w:sz w:val="18"/>
+              </w:rPr>
+              <w:t>持续集成</w:t>
+            </w:r>
+          </w:p>
+        </w:tc>
+        <w:tc>
+          <w:tcPr>
+            <w:tcW w:type="dxa" w:w="7632"/>
+            <w:shd w:fill="F3F7FA"/>
+            <w:tcMar>
+              <w:top w:w="110" w:type="dxa"/>
+              <w:start w:w="130" w:type="dxa"/>
+              <w:bottom w:w="110" w:type="dxa"/>
+              <w:end w:w="130" w:type="dxa"/>
+            </w:tcMar>
+            <w:vAlign w:val="center"/>
+          </w:tcPr>
+          <w:p>
+            <w:pPr>
+              <w:spacing w:after="0" w:line="276" w:lineRule="auto"/>
+              <w:jc w:val="left"/>
+            </w:pPr>
+            <w:r>
+              <w:rPr>
+                <w:rFonts w:ascii="Microsoft YaHei" w:hAnsi="Microsoft YaHei" w:eastAsia="Microsoft YaHei"/>
+                <w:color w:val="000000"/>
+                <w:sz w:val="18"/>
+              </w:rPr>
+              <w:t>GitHub Actions 在 push 和 pull request 时运行安装、Prisma Client 生成、lint、测试和 build</w:t>
+            </w:r>
+          </w:p>
+        </w:tc>
+      </w:tr>
+      <w:tr>
+        <w:trPr>
+          <w:cantSplit/>
+        </w:trPr>
+        <w:tc>
+          <w:tcPr>
+            <w:tcW w:type="dxa" w:w="1944"/>
+            <w:tcMar>
+              <w:top w:w="110" w:type="dxa"/>
+              <w:start w:w="130" w:type="dxa"/>
+              <w:bottom w:w="110" w:type="dxa"/>
+              <w:end w:w="130" w:type="dxa"/>
+            </w:tcMar>
+            <w:vAlign w:val="center"/>
+          </w:tcPr>
+          <w:p>
+            <w:pPr>
+              <w:spacing w:after="0" w:line="276" w:lineRule="auto"/>
+              <w:jc w:val="center"/>
+            </w:pPr>
+            <w:r>
+              <w:rPr>
+                <w:rFonts w:ascii="Microsoft YaHei" w:hAnsi="Microsoft YaHei" w:eastAsia="Microsoft YaHei"/>
+                <w:color w:val="000000"/>
+                <w:sz w:val="18"/>
+              </w:rPr>
+              <w:t>目标部署</w:t>
+            </w:r>
+          </w:p>
+        </w:tc>
+        <w:tc>
+          <w:tcPr>
+            <w:tcW w:type="dxa" w:w="7632"/>
+            <w:tcMar>
+              <w:top w:w="110" w:type="dxa"/>
+              <w:start w:w="130" w:type="dxa"/>
+              <w:bottom w:w="110" w:type="dxa"/>
+              <w:end w:w="130" w:type="dxa"/>
+            </w:tcMar>
+            <w:vAlign w:val="center"/>
+          </w:tcPr>
+          <w:p>
+            <w:pPr>
+              <w:spacing w:after="0" w:line="276" w:lineRule="auto"/>
+              <w:jc w:val="left"/>
+            </w:pPr>
+            <w:r>
+              <w:rPr>
+                <w:rFonts w:ascii="Microsoft YaHei" w:hAnsi="Microsoft YaHei" w:eastAsia="Microsoft YaHei"/>
+                <w:color w:val="000000"/>
+                <w:sz w:val="18"/>
+              </w:rPr>
+              <w:t>Vercel 托管 Next.js，托管 PostgreSQL 保存业务与认证数据</w:t>
+            </w:r>
+          </w:p>
+        </w:tc>
+      </w:tr>
+    </w:tbl>
     <w:p>
       <w:pPr>
-        <w:spacing w:after="140" w:line="324" w:lineRule="auto"/>
+        <w:spacing w:after="40"/>
       </w:pPr>
+    </w:p>
+    <w:p>
       <w:r>
         <w:rPr>
-          <w:rFonts w:ascii="Aptos" w:hAnsi="Aptos" w:eastAsia="Microsoft YaHei"/>
-          <w:b w:val="0"/>
-          <w:color w:val="000000"/>
+          <w:rFonts w:ascii="Microsoft YaHei" w:hAnsi="Microsoft YaHei" w:eastAsia="Microsoft YaHei"/>
           <w:sz w:val="21"/>
         </w:rPr>
-        <w:t>第一版暂不实现 AI 周报或总结、项目管理、标签体系、数据统计、多用户协作、云同步、移动端、附件上传及提醒功能。它们应在验证用户记录习惯与回顾价值后，再按优先级逐步加入。</w:t>
+        <w:t>应用代码已经适配 PostgreSQL，并准备了手动 migration workflow、部署检查脚本、环境变量模板和 SQLite 到 PostgreSQL 的导出、导入与校验工具。当前只完成本地和工程层面的准备，没有创建云端 PostgreSQL、Vercel 项目或正式域名，也没有执行 production 数据迁移。</w:t>
       </w:r>
     </w:p>
     <w:p>
       <w:pPr>
         <w:pStyle w:val="Heading1"/>
-        <w:spacing w:before="280" w:after="120"/>
+        <w:keepNext/>
       </w:pPr>
       <w:r>
+        <w:t>8 当前产品边界</w:t>
+      </w:r>
+    </w:p>
+    <w:p>
+      <w:r>
         <w:rPr>
-          <w:rFonts w:ascii="Aptos" w:hAnsi="Aptos" w:eastAsia="Microsoft YaHei"/>
-          <w:b/>
-          <w:color w:val="000000"/>
-          <w:sz w:val="30"/>
+          <w:rFonts w:ascii="Microsoft YaHei" w:hAnsi="Microsoft YaHei" w:eastAsia="Microsoft YaHei"/>
+          <w:sz w:val="21"/>
         </w:rPr>
-        <w:t>7 后续演进方向</w:t>
+        <w:t>为保持 MVP 简洁，当前版本暂不提供以下能力：</w:t>
       </w:r>
     </w:p>
     <w:p>
       <w:pPr>
         <w:pStyle w:val="ListBullet"/>
-        <w:spacing w:after="80" w:line="300" w:lineRule="auto"/>
+        <w:keepLines/>
       </w:pPr>
       <w:r>
         <w:rPr>
-          <w:rFonts w:ascii="Aptos" w:hAnsi="Aptos" w:eastAsia="Microsoft YaHei"/>
-          <w:color w:val="000000"/>
+          <w:rFonts w:ascii="Microsoft YaHei" w:hAnsi="Microsoft YaHei" w:eastAsia="Microsoft YaHei"/>
           <w:sz w:val="21"/>
         </w:rPr>
-        <w:t>项目与标签：将日志关联到科研课题、工程项目或学习主题。</w:t>
+        <w:t>统计图表、连续记录天数或科研效率评分。</w:t>
       </w:r>
     </w:p>
     <w:p>
       <w:pPr>
         <w:pStyle w:val="ListBullet"/>
-        <w:spacing w:after="80" w:line="300" w:lineRule="auto"/>
+        <w:keepLines/>
       </w:pPr>
       <w:r>
         <w:rPr>
-          <w:rFonts w:ascii="Aptos" w:hAnsi="Aptos" w:eastAsia="Microsoft YaHei"/>
-          <w:color w:val="000000"/>
+          <w:rFonts w:ascii="Microsoft YaHei" w:hAnsi="Microsoft YaHei" w:eastAsia="Microsoft YaHei"/>
           <w:sz w:val="21"/>
         </w:rPr>
-        <w:t>AI 辅助：生成周报和月报，归纳进展，识别长期阻塞问题。</w:t>
+        <w:t>AI 周报、月报、语义搜索、自动建议或智能问答。</w:t>
       </w:r>
     </w:p>
     <w:p>
       <w:pPr>
         <w:pStyle w:val="ListBullet"/>
-        <w:spacing w:after="80" w:line="300" w:lineRule="auto"/>
+        <w:keepLines/>
       </w:pPr>
       <w:r>
         <w:rPr>
-          <w:rFonts w:ascii="Aptos" w:hAnsi="Aptos" w:eastAsia="Microsoft YaHei"/>
-          <w:color w:val="000000"/>
+          <w:rFonts w:ascii="Microsoft YaHei" w:hAnsi="Microsoft YaHei" w:eastAsia="Microsoft YaHei"/>
           <w:sz w:val="21"/>
         </w:rPr>
-        <w:t>成长统计：展示记录频率、项目投入、问题类型和阶段性成果。</w:t>
+        <w:t>课题、项目、标签、附件和 Markdown 编辑器。</w:t>
       </w:r>
     </w:p>
     <w:p>
       <w:pPr>
         <w:pStyle w:val="ListBullet"/>
-        <w:spacing w:after="80" w:line="300" w:lineRule="auto"/>
+        <w:keepLines/>
       </w:pPr>
       <w:r>
         <w:rPr>
-          <w:rFonts w:ascii="Aptos" w:hAnsi="Aptos" w:eastAsia="Microsoft YaHei"/>
-          <w:color w:val="000000"/>
+          <w:rFonts w:ascii="Microsoft YaHei" w:hAnsi="Microsoft YaHei" w:eastAsia="Microsoft YaHei"/>
           <w:sz w:val="21"/>
         </w:rPr>
-        <w:t>数据能力：支持导出 Markdown 或 PDF，并逐步支持云端同步。</w:t>
+        <w:t>团队空间、共享日志、评论、审批或多人协作。</w:t>
+      </w:r>
+    </w:p>
+    <w:p>
+      <w:pPr>
+        <w:pStyle w:val="ListBullet"/>
+        <w:keepLines/>
+      </w:pPr>
+      <w:r>
+        <w:rPr>
+          <w:rFonts w:ascii="Microsoft YaHei" w:hAnsi="Microsoft YaHei" w:eastAsia="Microsoft YaHei"/>
+          <w:sz w:val="21"/>
+        </w:rPr>
+        <w:t>邮箱修改、头像管理、找回密码和第三方账号登录。</w:t>
+      </w:r>
+    </w:p>
+    <w:p>
+      <w:pPr>
+        <w:pStyle w:val="ListBullet"/>
+        <w:keepLines/>
+      </w:pPr>
+      <w:r>
+        <w:rPr>
+          <w:rFonts w:ascii="Microsoft YaHei" w:hAnsi="Microsoft YaHei" w:eastAsia="Microsoft YaHei"/>
+          <w:sz w:val="21"/>
+        </w:rPr>
+        <w:t>移动端应用、离线模式、通知和提醒。</w:t>
+      </w:r>
+    </w:p>
+    <w:p>
+      <w:pPr>
+        <w:pStyle w:val="ListBullet"/>
+        <w:keepLines/>
+      </w:pPr>
+      <w:r>
+        <w:rPr>
+          <w:rFonts w:ascii="Microsoft YaHei" w:hAnsi="Microsoft YaHei" w:eastAsia="Microsoft YaHei"/>
+          <w:sz w:val="21"/>
+        </w:rPr>
+        <w:t>公开注册策略、管理员后台和生产级监控告警。</w:t>
       </w:r>
     </w:p>
     <w:p>
       <w:pPr>
         <w:pStyle w:val="Heading1"/>
-        <w:spacing w:before="280" w:after="120"/>
+        <w:keepNext/>
       </w:pPr>
       <w:r>
-        <w:rPr>
-          <w:rFonts w:ascii="Aptos" w:hAnsi="Aptos" w:eastAsia="Microsoft YaHei"/>
-          <w:b/>
-          <w:color w:val="000000"/>
-          <w:sz w:val="30"/>
-        </w:rPr>
-        <w:t>8 MVP 成功标准</w:t>
+        <w:t>9 版本演进</w:t>
+      </w:r>
+    </w:p>
+    <w:tbl>
+      <w:tblPr>
+        <w:tblW w:type="dxa" w:w="9576"/>
+        <w:jc w:val="center"/>
+        <w:tblLayout w:type="fixed"/>
+        <w:tblLook w:firstColumn="1" w:firstRow="1" w:lastColumn="0" w:lastRow="0" w:noHBand="0" w:noVBand="1" w:val="04A0"/>
+        <w:tblBorders>
+          <w:top w:val="single" w:sz="6" w:space="0" w:color="D9D9D9"/>
+          <w:left w:val="single" w:sz="6" w:space="0" w:color="D9D9D9"/>
+          <w:bottom w:val="single" w:sz="6" w:space="0" w:color="D9D9D9"/>
+          <w:right w:val="single" w:sz="6" w:space="0" w:color="D9D9D9"/>
+          <w:insideH w:val="single" w:sz="6" w:space="0" w:color="D9D9D9"/>
+          <w:insideV w:val="single" w:sz="6" w:space="0" w:color="D9D9D9"/>
+        </w:tblBorders>
+      </w:tblPr>
+      <w:tblGrid>
+        <w:gridCol w:w="1440"/>
+        <w:gridCol w:w="6840"/>
+        <w:gridCol w:w="1296"/>
+      </w:tblGrid>
+      <w:tr>
+        <w:trPr>
+          <w:tblHeader w:val="true"/>
+          <w:cantSplit/>
+        </w:trPr>
+        <w:tc>
+          <w:tcPr>
+            <w:tcW w:type="dxa" w:w="1440"/>
+            <w:shd w:fill="1F4E78"/>
+            <w:tcMar>
+              <w:top w:w="110" w:type="dxa"/>
+              <w:start w:w="130" w:type="dxa"/>
+              <w:bottom w:w="110" w:type="dxa"/>
+              <w:end w:w="130" w:type="dxa"/>
+            </w:tcMar>
+            <w:vAlign w:val="center"/>
+          </w:tcPr>
+          <w:p>
+            <w:pPr>
+              <w:spacing w:after="0"/>
+              <w:jc w:val="center"/>
+            </w:pPr>
+            <w:r>
+              <w:rPr>
+                <w:rFonts w:ascii="Microsoft YaHei" w:hAnsi="Microsoft YaHei" w:eastAsia="Microsoft YaHei"/>
+                <w:b/>
+                <w:color w:val="FFFFFF"/>
+                <w:sz w:val="19"/>
+              </w:rPr>
+              <w:t>阶段</w:t>
+            </w:r>
+          </w:p>
+        </w:tc>
+        <w:tc>
+          <w:tcPr>
+            <w:tcW w:type="dxa" w:w="6840"/>
+            <w:shd w:fill="1F4E78"/>
+            <w:tcMar>
+              <w:top w:w="110" w:type="dxa"/>
+              <w:start w:w="130" w:type="dxa"/>
+              <w:bottom w:w="110" w:type="dxa"/>
+              <w:end w:w="130" w:type="dxa"/>
+            </w:tcMar>
+            <w:vAlign w:val="center"/>
+          </w:tcPr>
+          <w:p>
+            <w:pPr>
+              <w:spacing w:after="0"/>
+              <w:jc w:val="center"/>
+            </w:pPr>
+            <w:r>
+              <w:rPr>
+                <w:rFonts w:ascii="Microsoft YaHei" w:hAnsi="Microsoft YaHei" w:eastAsia="Microsoft YaHei"/>
+                <w:b/>
+                <w:color w:val="FFFFFF"/>
+                <w:sz w:val="19"/>
+              </w:rPr>
+              <w:t>交付内容</w:t>
+            </w:r>
+          </w:p>
+        </w:tc>
+        <w:tc>
+          <w:tcPr>
+            <w:tcW w:type="dxa" w:w="1296"/>
+            <w:shd w:fill="1F4E78"/>
+            <w:tcMar>
+              <w:top w:w="110" w:type="dxa"/>
+              <w:start w:w="130" w:type="dxa"/>
+              <w:bottom w:w="110" w:type="dxa"/>
+              <w:end w:w="130" w:type="dxa"/>
+            </w:tcMar>
+            <w:vAlign w:val="center"/>
+          </w:tcPr>
+          <w:p>
+            <w:pPr>
+              <w:spacing w:after="0"/>
+              <w:jc w:val="center"/>
+            </w:pPr>
+            <w:r>
+              <w:rPr>
+                <w:rFonts w:ascii="Microsoft YaHei" w:hAnsi="Microsoft YaHei" w:eastAsia="Microsoft YaHei"/>
+                <w:b/>
+                <w:color w:val="FFFFFF"/>
+                <w:sz w:val="19"/>
+              </w:rPr>
+              <w:t>状态</w:t>
+            </w:r>
+          </w:p>
+        </w:tc>
+      </w:tr>
+      <w:tr>
+        <w:trPr>
+          <w:cantSplit/>
+        </w:trPr>
+        <w:tc>
+          <w:tcPr>
+            <w:tcW w:type="dxa" w:w="1440"/>
+            <w:tcMar>
+              <w:top w:w="110" w:type="dxa"/>
+              <w:start w:w="130" w:type="dxa"/>
+              <w:bottom w:w="110" w:type="dxa"/>
+              <w:end w:w="130" w:type="dxa"/>
+            </w:tcMar>
+            <w:vAlign w:val="center"/>
+          </w:tcPr>
+          <w:p>
+            <w:pPr>
+              <w:spacing w:after="0" w:line="276" w:lineRule="auto"/>
+              <w:jc w:val="center"/>
+            </w:pPr>
+            <w:r>
+              <w:rPr>
+                <w:rFonts w:ascii="Microsoft YaHei" w:hAnsi="Microsoft YaHei" w:eastAsia="Microsoft YaHei"/>
+                <w:color w:val="000000"/>
+                <w:sz w:val="18"/>
+              </w:rPr>
+              <w:t>v1.0</w:t>
+            </w:r>
+          </w:p>
+        </w:tc>
+        <w:tc>
+          <w:tcPr>
+            <w:tcW w:type="dxa" w:w="6840"/>
+            <w:tcMar>
+              <w:top w:w="110" w:type="dxa"/>
+              <w:start w:w="130" w:type="dxa"/>
+              <w:bottom w:w="110" w:type="dxa"/>
+              <w:end w:w="130" w:type="dxa"/>
+            </w:tcMar>
+            <w:vAlign w:val="center"/>
+          </w:tcPr>
+          <w:p>
+            <w:pPr>
+              <w:spacing w:after="0" w:line="276" w:lineRule="auto"/>
+              <w:jc w:val="left"/>
+            </w:pPr>
+            <w:r>
+              <w:rPr>
+                <w:rFonts w:ascii="Microsoft YaHei" w:hAnsi="Microsoft YaHei" w:eastAsia="Microsoft YaHei"/>
+                <w:color w:val="000000"/>
+                <w:sz w:val="18"/>
+              </w:rPr>
+              <w:t>单用户 Diary MVP、历史、详情和关键词搜索。</w:t>
+            </w:r>
+          </w:p>
+        </w:tc>
+        <w:tc>
+          <w:tcPr>
+            <w:tcW w:type="dxa" w:w="1296"/>
+            <w:tcMar>
+              <w:top w:w="110" w:type="dxa"/>
+              <w:start w:w="130" w:type="dxa"/>
+              <w:bottom w:w="110" w:type="dxa"/>
+              <w:end w:w="130" w:type="dxa"/>
+            </w:tcMar>
+            <w:vAlign w:val="center"/>
+          </w:tcPr>
+          <w:p>
+            <w:pPr>
+              <w:spacing w:after="0" w:line="276" w:lineRule="auto"/>
+              <w:jc w:val="center"/>
+            </w:pPr>
+            <w:r>
+              <w:rPr>
+                <w:rFonts w:ascii="Microsoft YaHei" w:hAnsi="Microsoft YaHei" w:eastAsia="Microsoft YaHei"/>
+                <w:color w:val="000000"/>
+                <w:sz w:val="18"/>
+              </w:rPr>
+              <w:t>已完成</w:t>
+            </w:r>
+          </w:p>
+        </w:tc>
+      </w:tr>
+      <w:tr>
+        <w:trPr>
+          <w:cantSplit/>
+        </w:trPr>
+        <w:tc>
+          <w:tcPr>
+            <w:tcW w:type="dxa" w:w="1440"/>
+            <w:shd w:fill="F3F7FA"/>
+            <w:tcMar>
+              <w:top w:w="110" w:type="dxa"/>
+              <w:start w:w="130" w:type="dxa"/>
+              <w:bottom w:w="110" w:type="dxa"/>
+              <w:end w:w="130" w:type="dxa"/>
+            </w:tcMar>
+            <w:vAlign w:val="center"/>
+          </w:tcPr>
+          <w:p>
+            <w:pPr>
+              <w:spacing w:after="0" w:line="276" w:lineRule="auto"/>
+              <w:jc w:val="center"/>
+            </w:pPr>
+            <w:r>
+              <w:rPr>
+                <w:rFonts w:ascii="Microsoft YaHei" w:hAnsi="Microsoft YaHei" w:eastAsia="Microsoft YaHei"/>
+                <w:color w:val="000000"/>
+                <w:sz w:val="18"/>
+              </w:rPr>
+              <w:t>v2.0</w:t>
+            </w:r>
+          </w:p>
+        </w:tc>
+        <w:tc>
+          <w:tcPr>
+            <w:tcW w:type="dxa" w:w="6840"/>
+            <w:shd w:fill="F3F7FA"/>
+            <w:tcMar>
+              <w:top w:w="110" w:type="dxa"/>
+              <w:start w:w="130" w:type="dxa"/>
+              <w:bottom w:w="110" w:type="dxa"/>
+              <w:end w:w="130" w:type="dxa"/>
+            </w:tcMar>
+            <w:vAlign w:val="center"/>
+          </w:tcPr>
+          <w:p>
+            <w:pPr>
+              <w:spacing w:after="0" w:line="276" w:lineRule="auto"/>
+              <w:jc w:val="left"/>
+            </w:pPr>
+            <w:r>
+              <w:rPr>
+                <w:rFonts w:ascii="Microsoft YaHei" w:hAnsi="Microsoft YaHei" w:eastAsia="Microsoft YaHei"/>
+                <w:color w:val="000000"/>
+                <w:sz w:val="18"/>
+              </w:rPr>
+              <w:t>Better Auth 用户系统、Session 和 Diary 用户数据隔离。</w:t>
+            </w:r>
+          </w:p>
+        </w:tc>
+        <w:tc>
+          <w:tcPr>
+            <w:tcW w:type="dxa" w:w="1296"/>
+            <w:shd w:fill="F3F7FA"/>
+            <w:tcMar>
+              <w:top w:w="110" w:type="dxa"/>
+              <w:start w:w="130" w:type="dxa"/>
+              <w:bottom w:w="110" w:type="dxa"/>
+              <w:end w:w="130" w:type="dxa"/>
+            </w:tcMar>
+            <w:vAlign w:val="center"/>
+          </w:tcPr>
+          <w:p>
+            <w:pPr>
+              <w:spacing w:after="0" w:line="276" w:lineRule="auto"/>
+              <w:jc w:val="center"/>
+            </w:pPr>
+            <w:r>
+              <w:rPr>
+                <w:rFonts w:ascii="Microsoft YaHei" w:hAnsi="Microsoft YaHei" w:eastAsia="Microsoft YaHei"/>
+                <w:color w:val="000000"/>
+                <w:sz w:val="18"/>
+              </w:rPr>
+              <w:t>已完成</w:t>
+            </w:r>
+          </w:p>
+        </w:tc>
+      </w:tr>
+      <w:tr>
+        <w:trPr>
+          <w:cantSplit/>
+        </w:trPr>
+        <w:tc>
+          <w:tcPr>
+            <w:tcW w:type="dxa" w:w="1440"/>
+            <w:tcMar>
+              <w:top w:w="110" w:type="dxa"/>
+              <w:start w:w="130" w:type="dxa"/>
+              <w:bottom w:w="110" w:type="dxa"/>
+              <w:end w:w="130" w:type="dxa"/>
+            </w:tcMar>
+            <w:vAlign w:val="center"/>
+          </w:tcPr>
+          <w:p>
+            <w:pPr>
+              <w:spacing w:after="0" w:line="276" w:lineRule="auto"/>
+              <w:jc w:val="center"/>
+            </w:pPr>
+            <w:r>
+              <w:rPr>
+                <w:rFonts w:ascii="Microsoft YaHei" w:hAnsi="Microsoft YaHei" w:eastAsia="Microsoft YaHei"/>
+                <w:color w:val="000000"/>
+                <w:sz w:val="18"/>
+              </w:rPr>
+              <w:t>v2.1</w:t>
+            </w:r>
+          </w:p>
+        </w:tc>
+        <w:tc>
+          <w:tcPr>
+            <w:tcW w:type="dxa" w:w="6840"/>
+            <w:tcMar>
+              <w:top w:w="110" w:type="dxa"/>
+              <w:start w:w="130" w:type="dxa"/>
+              <w:bottom w:w="110" w:type="dxa"/>
+              <w:end w:w="130" w:type="dxa"/>
+            </w:tcMar>
+            <w:vAlign w:val="center"/>
+          </w:tcPr>
+          <w:p>
+            <w:pPr>
+              <w:spacing w:after="0" w:line="276" w:lineRule="auto"/>
+              <w:jc w:val="left"/>
+            </w:pPr>
+            <w:r>
+              <w:rPr>
+                <w:rFonts w:ascii="Microsoft YaHei" w:hAnsi="Microsoft YaHei" w:eastAsia="Microsoft YaHei"/>
+                <w:color w:val="000000"/>
+                <w:sz w:val="18"/>
+              </w:rPr>
+              <w:t>用户时区、个人设置和登录后的基础 Dashboard。</w:t>
+            </w:r>
+          </w:p>
+        </w:tc>
+        <w:tc>
+          <w:tcPr>
+            <w:tcW w:type="dxa" w:w="1296"/>
+            <w:tcMar>
+              <w:top w:w="110" w:type="dxa"/>
+              <w:start w:w="130" w:type="dxa"/>
+              <w:bottom w:w="110" w:type="dxa"/>
+              <w:end w:w="130" w:type="dxa"/>
+            </w:tcMar>
+            <w:vAlign w:val="center"/>
+          </w:tcPr>
+          <w:p>
+            <w:pPr>
+              <w:spacing w:after="0" w:line="276" w:lineRule="auto"/>
+              <w:jc w:val="center"/>
+            </w:pPr>
+            <w:r>
+              <w:rPr>
+                <w:rFonts w:ascii="Microsoft YaHei" w:hAnsi="Microsoft YaHei" w:eastAsia="Microsoft YaHei"/>
+                <w:color w:val="000000"/>
+                <w:sz w:val="18"/>
+              </w:rPr>
+              <w:t>已完成</w:t>
+            </w:r>
+          </w:p>
+        </w:tc>
+      </w:tr>
+      <w:tr>
+        <w:trPr>
+          <w:cantSplit/>
+        </w:trPr>
+        <w:tc>
+          <w:tcPr>
+            <w:tcW w:type="dxa" w:w="1440"/>
+            <w:shd w:fill="F3F7FA"/>
+            <w:tcMar>
+              <w:top w:w="110" w:type="dxa"/>
+              <w:start w:w="130" w:type="dxa"/>
+              <w:bottom w:w="110" w:type="dxa"/>
+              <w:end w:w="130" w:type="dxa"/>
+            </w:tcMar>
+            <w:vAlign w:val="center"/>
+          </w:tcPr>
+          <w:p>
+            <w:pPr>
+              <w:spacing w:after="0" w:line="276" w:lineRule="auto"/>
+              <w:jc w:val="center"/>
+            </w:pPr>
+            <w:r>
+              <w:rPr>
+                <w:rFonts w:ascii="Microsoft YaHei" w:hAnsi="Microsoft YaHei" w:eastAsia="Microsoft YaHei"/>
+                <w:color w:val="000000"/>
+                <w:sz w:val="18"/>
+              </w:rPr>
+              <w:t>v2.2</w:t>
+            </w:r>
+          </w:p>
+        </w:tc>
+        <w:tc>
+          <w:tcPr>
+            <w:tcW w:type="dxa" w:w="6840"/>
+            <w:shd w:fill="F3F7FA"/>
+            <w:tcMar>
+              <w:top w:w="110" w:type="dxa"/>
+              <w:start w:w="130" w:type="dxa"/>
+              <w:bottom w:w="110" w:type="dxa"/>
+              <w:end w:w="130" w:type="dxa"/>
+            </w:tcMar>
+            <w:vAlign w:val="center"/>
+          </w:tcPr>
+          <w:p>
+            <w:pPr>
+              <w:spacing w:after="0" w:line="276" w:lineRule="auto"/>
+              <w:jc w:val="left"/>
+            </w:pPr>
+            <w:r>
+              <w:rPr>
+                <w:rFonts w:ascii="Microsoft YaHei" w:hAnsi="Microsoft YaHei" w:eastAsia="Microsoft YaHei"/>
+                <w:color w:val="000000"/>
+                <w:sz w:val="18"/>
+              </w:rPr>
+              <w:t>PostgreSQL 适配、迁移演练、健康检查、CI、手动 migration workflow、本地 PostgreSQL 和 staging 部署准备。</w:t>
+            </w:r>
+          </w:p>
+        </w:tc>
+        <w:tc>
+          <w:tcPr>
+            <w:tcW w:type="dxa" w:w="1296"/>
+            <w:shd w:fill="F3F7FA"/>
+            <w:tcMar>
+              <w:top w:w="110" w:type="dxa"/>
+              <w:start w:w="130" w:type="dxa"/>
+              <w:bottom w:w="110" w:type="dxa"/>
+              <w:end w:w="130" w:type="dxa"/>
+            </w:tcMar>
+            <w:vAlign w:val="center"/>
+          </w:tcPr>
+          <w:p>
+            <w:pPr>
+              <w:spacing w:after="0" w:line="276" w:lineRule="auto"/>
+              <w:jc w:val="center"/>
+            </w:pPr>
+            <w:r>
+              <w:rPr>
+                <w:rFonts w:ascii="Microsoft YaHei" w:hAnsi="Microsoft YaHei" w:eastAsia="Microsoft YaHei"/>
+                <w:color w:val="000000"/>
+                <w:sz w:val="18"/>
+              </w:rPr>
+              <w:t>进行中</w:t>
+            </w:r>
+          </w:p>
+        </w:tc>
+      </w:tr>
+    </w:tbl>
+    <w:p>
+      <w:pPr>
+        <w:spacing w:after="40"/>
+      </w:pPr>
+    </w:p>
+    <w:p>
+      <w:pPr>
+        <w:pStyle w:val="Heading1"/>
+        <w:keepNext/>
+        <w:pageBreakBefore/>
+      </w:pPr>
+      <w:r>
+        <w:t>10 下一阶段重点</w:t>
       </w:r>
     </w:p>
     <w:p>
       <w:pPr>
-        <w:spacing w:after="140" w:line="324" w:lineRule="auto"/>
+        <w:pStyle w:val="ListBullet"/>
+        <w:keepLines/>
       </w:pPr>
       <w:r>
         <w:rPr>
-          <w:rFonts w:ascii="Aptos" w:hAnsi="Aptos" w:eastAsia="Microsoft YaHei"/>
-          <w:b w:val="0"/>
-          <w:color w:val="000000"/>
+          <w:rFonts w:ascii="Microsoft YaHei" w:hAnsi="Microsoft YaHei" w:eastAsia="Microsoft YaHei"/>
           <w:sz w:val="21"/>
         </w:rPr>
-        <w:t>用户应能在几分钟内完成每日记录，并在需要时快速找回过去的工作、问题和计划。MVP 的核心衡量标准是记录足够轻量，回顾足够有价值。</w:t>
+        <w:t>创建与 production 隔离的 staging PostgreSQL 和 Vercel 项目。</w:t>
+      </w:r>
+    </w:p>
+    <w:p>
+      <w:pPr>
+        <w:pStyle w:val="ListBullet"/>
+        <w:keepLines/>
+      </w:pPr>
+      <w:r>
+        <w:rPr>
+          <w:rFonts w:ascii="Microsoft YaHei" w:hAnsi="Microsoft YaHei" w:eastAsia="Microsoft YaHei"/>
+          <w:sz w:val="21"/>
+        </w:rPr>
+        <w:t>配置 DATABASE_URL、DIRECT_URL、BETTER_AUTH_SECRET 和 BETTER_AUTH_URL。</w:t>
+      </w:r>
+    </w:p>
+    <w:p>
+      <w:pPr>
+        <w:pStyle w:val="ListBullet"/>
+        <w:keepLines/>
+      </w:pPr>
+      <w:r>
+        <w:rPr>
+          <w:rFonts w:ascii="Microsoft YaHei" w:hAnsi="Microsoft YaHei" w:eastAsia="Microsoft YaHei"/>
+          <w:sz w:val="21"/>
+        </w:rPr>
+        <w:t>先执行已提交的 PostgreSQL migration，再部署同一个 Git commit。</w:t>
+      </w:r>
+    </w:p>
+    <w:p>
+      <w:pPr>
+        <w:pStyle w:val="ListBullet"/>
+        <w:keepLines/>
+      </w:pPr>
+      <w:r>
+        <w:rPr>
+          <w:rFonts w:ascii="Microsoft YaHei" w:hAnsi="Microsoft YaHei" w:eastAsia="Microsoft YaHei"/>
+          <w:sz w:val="21"/>
+        </w:rPr>
+        <w:t>完成健康检查、双用户认证、Session、Dashboard、Diary 隔离、搜索、历史和时区冒烟测试。</w:t>
+      </w:r>
+    </w:p>
+    <w:p>
+      <w:pPr>
+        <w:pStyle w:val="ListBullet"/>
+        <w:keepLines/>
+      </w:pPr>
+      <w:r>
+        <w:rPr>
+          <w:rFonts w:ascii="Microsoft YaHei" w:hAnsi="Microsoft YaHei" w:eastAsia="Microsoft YaHei"/>
+          <w:sz w:val="21"/>
+        </w:rPr>
+        <w:t>在 staging 完成 SQLite 数据迁移复演后，再单独规划 production 切换。</w:t>
+      </w:r>
+    </w:p>
+    <w:p>
+      <w:pPr>
+        <w:pStyle w:val="Heading1"/>
+        <w:keepNext/>
+      </w:pPr>
+      <w:r>
+        <w:t>11 当前成功标准</w:t>
+      </w:r>
+    </w:p>
+    <w:p>
+      <w:r>
+        <w:rPr>
+          <w:rFonts w:ascii="Microsoft YaHei" w:hAnsi="Microsoft YaHei" w:eastAsia="Microsoft YaHei"/>
+          <w:sz w:val="21"/>
+        </w:rPr>
+        <w:t>用户应能在几分钟内完成每天的科研记录，并在之后通过历史或搜索找回自己的工作、问题和计划。多人使用时，用户只能访问自己的 Diary；系统按用户时区稳定判断今天；刷新页面后登录状态和已保存数据仍然存在。进入云端部署阶段后，staging 还必须通过数据库 migration、健康检查和双用户隔离冒烟测试，才能继续准备 production。</w:t>
       </w:r>
     </w:p>
     <w:sectPr>
       <w:pgSz w:w="12240" w:h="15840"/>
-      <w:pgMar w:top="1304" w:right="1417" w:bottom="1304" w:left="1417" w:header="720" w:footer="720" w:gutter="0"/>
+      <w:pgMar w:top="1181" w:right="1325" w:bottom="1181" w:left="1325" w:header="720" w:footer="720" w:gutter="0"/>
       <w:cols w:space="720"/>
       <w:docGrid w:linePitch="360"/>
     </w:sectPr>
@@ -1038,8 +3385,14 @@
     <w:name w:val="Normal"/>
     <w:qFormat/>
     <w:rsid w:val="00FC693F"/>
+    <w:pPr>
+      <w:spacing w:after="120" w:line="317" w:lineRule="auto"/>
+      <w:jc w:val="left"/>
+    </w:pPr>
     <w:rPr>
       <w:rFonts w:ascii="Microsoft YaHei" w:hAnsi="Microsoft YaHei" w:eastAsia="Microsoft YaHei"/>
+      <w:color w:val="000000"/>
+      <w:sz w:val="21"/>
     </w:rPr>
   </w:style>
   <w:style w:type="paragraph" w:styleId="Header">
@@ -1097,15 +3450,15 @@
     <w:pPr>
       <w:keepNext/>
       <w:keepLines/>
-      <w:spacing w:before="480" w:after="0"/>
+      <w:spacing w:before="360" w:after="140"/>
       <w:outlineLvl w:val="0"/>
     </w:pPr>
     <w:rPr>
-      <w:rFonts w:asciiTheme="majorHAnsi" w:eastAsiaTheme="majorEastAsia" w:hAnsiTheme="majorHAnsi" w:cstheme="majorBidi"/>
+      <w:rFonts w:asciiTheme="majorHAnsi" w:eastAsiaTheme="majorEastAsia" w:hAnsiTheme="majorHAnsi" w:cstheme="majorBidi" w:ascii="Microsoft YaHei" w:hAnsi="Microsoft YaHei" w:eastAsia="Microsoft YaHei"/>
       <w:b/>
       <w:bCs/>
-      <w:color w:val="365F91" w:themeColor="accent1" w:themeShade="BF"/>
-      <w:sz w:val="28"/>
+      <w:color w:val="000000"/>
+      <w:sz w:val="30"/>
       <w:szCs w:val="28"/>
     </w:rPr>
   </w:style>
@@ -1121,15 +3474,15 @@
     <w:pPr>
       <w:keepNext/>
       <w:keepLines/>
-      <w:spacing w:before="200" w:after="0"/>
+      <w:spacing w:before="220" w:after="100"/>
       <w:outlineLvl w:val="1"/>
     </w:pPr>
     <w:rPr>
-      <w:rFonts w:asciiTheme="majorHAnsi" w:eastAsiaTheme="majorEastAsia" w:hAnsiTheme="majorHAnsi" w:cstheme="majorBidi"/>
+      <w:rFonts w:asciiTheme="majorHAnsi" w:eastAsiaTheme="majorEastAsia" w:hAnsiTheme="majorHAnsi" w:cstheme="majorBidi" w:ascii="Microsoft YaHei" w:hAnsi="Microsoft YaHei" w:eastAsia="Microsoft YaHei"/>
       <w:b/>
       <w:bCs/>
-      <w:color w:val="4F81BD" w:themeColor="accent1"/>
-      <w:sz w:val="26"/>
+      <w:color w:val="000000"/>
+      <w:sz w:val="24"/>
       <w:szCs w:val="26"/>
     </w:rPr>
   </w:style>
@@ -1383,18 +3736,16 @@
     <w:qFormat/>
     <w:rsid w:val="00FC693F"/>
     <w:pPr>
-      <w:pBdr>
-        <w:bottom w:val="single" w:sz="8" w:space="4" w:color="4F81BD" w:themeColor="accent1"/>
-      </w:pBdr>
-      <w:spacing w:after="300" w:line="240" w:lineRule="auto"/>
+      <w:spacing w:after="200" w:line="240" w:lineRule="auto"/>
       <w:contextualSpacing/>
     </w:pPr>
     <w:rPr>
-      <w:rFonts w:asciiTheme="majorHAnsi" w:eastAsiaTheme="majorEastAsia" w:hAnsiTheme="majorHAnsi" w:cstheme="majorBidi"/>
-      <w:color w:val="17365D" w:themeColor="text2" w:themeShade="BF"/>
+      <w:rFonts w:asciiTheme="majorHAnsi" w:eastAsiaTheme="majorEastAsia" w:hAnsiTheme="majorHAnsi" w:cstheme="majorBidi" w:ascii="Microsoft YaHei" w:hAnsi="Microsoft YaHei" w:eastAsia="Microsoft YaHei"/>
+      <w:b/>
+      <w:color w:val="000000"/>
       <w:spacing w:val="5"/>
       <w:kern w:val="28"/>
-      <w:sz w:val="52"/>
+      <w:sz w:val="50"/>
       <w:szCs w:val="52"/>
     </w:rPr>
   </w:style>
@@ -1568,8 +3919,13 @@
       <w:numPr>
         <w:numId w:val="1"/>
       </w:numPr>
+      <w:spacing w:after="60" w:line="288" w:lineRule="auto"/>
       <w:contextualSpacing/>
     </w:pPr>
+    <w:rPr>
+      <w:rFonts w:ascii="Microsoft YaHei" w:hAnsi="Microsoft YaHei" w:eastAsia="Microsoft YaHei"/>
+      <w:sz w:val="21"/>
+    </w:rPr>
   </w:style>
   <w:style w:type="paragraph" w:styleId="ListBullet2">
     <w:name w:val="List Bullet 2"/>

</xml_diff>